<commit_message>
added kayden's student id
</commit_message>
<xml_diff>
--- a/CA2_group_template.docx
+++ b/CA2_group_template.docx
@@ -202,7 +202,11 @@
           <w:tcPr>
             <w:tcW w:w="2489" w:type="dxa"/>
           </w:tcPr>
-          <w:p/>
+          <w:p>
+            <w:r>
+              <w:t>67</w:t>
+            </w:r>
+          </w:p>
         </w:tc>
       </w:tr>
       <w:tr>
@@ -236,7 +240,11 @@
           <w:tcPr>
             <w:tcW w:w="2489" w:type="dxa"/>
           </w:tcPr>
-          <w:p/>
+          <w:p>
+            <w:r>
+              <w:t>67</w:t>
+            </w:r>
+          </w:p>
         </w:tc>
       </w:tr>
       <w:tr>
@@ -247,7 +255,14 @@
           <w:tcPr>
             <w:tcW w:w="1980" w:type="dxa"/>
           </w:tcPr>
-          <w:p/>
+          <w:p>
+            <w:r>
+              <w:t>p</w:t>
+            </w:r>
+            <w:r>
+              <w:t>2518846</w:t>
+            </w:r>
+          </w:p>
         </w:tc>
         <w:tc>
           <w:tcPr>
@@ -263,7 +278,11 @@
           <w:tcPr>
             <w:tcW w:w="2489" w:type="dxa"/>
           </w:tcPr>
-          <w:p/>
+          <w:p>
+            <w:r>
+              <w:t>67</w:t>
+            </w:r>
+          </w:p>
         </w:tc>
       </w:tr>
       <w:tr>
@@ -2694,6 +2713,9 @@
         <w:t xml:space="preserve"> </w:t>
       </w:r>
       <w:r>
+        <w:rPr>
+          <w:noProof/>
+        </w:rPr>
         <w:drawing>
           <wp:inline distT="0" distB="0" distL="0" distR="0" wp14:anchorId="00A1FB1C" wp14:editId="47F10C1E">
             <wp:extent cx="6190615" cy="4439920"/>
@@ -14774,6 +14796,7 @@
   <w:style w:type="character" w:default="1" w:styleId="DefaultParagraphFont">
     <w:name w:val="Default Paragraph Font"/>
     <w:uiPriority w:val="1"/>
+    <w:semiHidden/>
     <w:unhideWhenUsed/>
   </w:style>
   <w:style w:type="table" w:default="1" w:styleId="TableNormal">
@@ -16464,7 +16487,16 @@
 </file>
 
 <file path=customXml/item1.xml><?xml version="1.0" encoding="utf-8"?>
-<b:Sources xmlns:b="http://schemas.openxmlformats.org/officeDocument/2006/bibliography" xmlns="http://schemas.openxmlformats.org/officeDocument/2006/bibliography" SelectedStyle="\MLA.XSL" StyleName="MLA"/>
+<p:properties xmlns:p="http://schemas.microsoft.com/office/2006/metadata/properties" xmlns:xsi="http://www.w3.org/2001/XMLSchema-instance" xmlns:pc="http://schemas.microsoft.com/office/infopath/2007/PartnerControls">
+  <documentManagement>
+    <_ip_UnifiedCompliancePolicyUIAction xmlns="http://schemas.microsoft.com/sharepoint/v3" xsi:nil="true"/>
+    <lcf76f155ced4ddcb4097134ff3c332f xmlns="72f5c66d-4f9b-4523-9c59-0147434cba56">
+      <Terms xmlns="http://schemas.microsoft.com/office/infopath/2007/PartnerControls"/>
+    </lcf76f155ced4ddcb4097134ff3c332f>
+    <TaxCatchAll xmlns="d5671106-6e7e-4942-8aee-9bcd5dd7e66b" xsi:nil="true"/>
+    <_ip_UnifiedCompliancePolicyProperties xmlns="http://schemas.microsoft.com/sharepoint/v3" xsi:nil="true"/>
+  </documentManagement>
+</p:properties>
 </file>
 
 <file path=customXml/item2.xml><?xml version="1.0" encoding="utf-8"?>
@@ -16477,16 +16509,7 @@
 </file>
 
 <file path=customXml/item3.xml><?xml version="1.0" encoding="utf-8"?>
-<p:properties xmlns:p="http://schemas.microsoft.com/office/2006/metadata/properties" xmlns:xsi="http://www.w3.org/2001/XMLSchema-instance" xmlns:pc="http://schemas.microsoft.com/office/infopath/2007/PartnerControls">
-  <documentManagement>
-    <_ip_UnifiedCompliancePolicyUIAction xmlns="http://schemas.microsoft.com/sharepoint/v3" xsi:nil="true"/>
-    <lcf76f155ced4ddcb4097134ff3c332f xmlns="72f5c66d-4f9b-4523-9c59-0147434cba56">
-      <Terms xmlns="http://schemas.microsoft.com/office/infopath/2007/PartnerControls"/>
-    </lcf76f155ced4ddcb4097134ff3c332f>
-    <TaxCatchAll xmlns="d5671106-6e7e-4942-8aee-9bcd5dd7e66b" xsi:nil="true"/>
-    <_ip_UnifiedCompliancePolicyProperties xmlns="http://schemas.microsoft.com/sharepoint/v3" xsi:nil="true"/>
-  </documentManagement>
-</p:properties>
+<b:Sources xmlns:b="http://schemas.openxmlformats.org/officeDocument/2006/bibliography" xmlns="http://schemas.openxmlformats.org/officeDocument/2006/bibliography" SelectedStyle="\MLA.XSL" StyleName="MLA"/>
 </file>
 
 <file path=customXml/item4.xml><?xml version="1.0" encoding="utf-8"?>
@@ -16702,9 +16725,13 @@
 </file>
 
 <file path=customXml/itemProps1.xml><?xml version="1.0" encoding="utf-8"?>
-<ds:datastoreItem xmlns:ds="http://schemas.openxmlformats.org/officeDocument/2006/customXml" ds:itemID="{6A404842-743E-4BBC-99A7-70A911F17733}">
+<ds:datastoreItem xmlns:ds="http://schemas.openxmlformats.org/officeDocument/2006/customXml" ds:itemID="{2FE68222-D1D7-4405-9D8B-445901EEA94E}">
   <ds:schemaRefs>
-    <ds:schemaRef ds:uri="http://schemas.openxmlformats.org/officeDocument/2006/bibliography"/>
+    <ds:schemaRef ds:uri="http://schemas.microsoft.com/office/2006/metadata/properties"/>
+    <ds:schemaRef ds:uri="http://schemas.microsoft.com/office/infopath/2007/PartnerControls"/>
+    <ds:schemaRef ds:uri="http://schemas.microsoft.com/sharepoint/v3"/>
+    <ds:schemaRef ds:uri="72f5c66d-4f9b-4523-9c59-0147434cba56"/>
+    <ds:schemaRef ds:uri="d5671106-6e7e-4942-8aee-9bcd5dd7e66b"/>
   </ds:schemaRefs>
 </ds:datastoreItem>
 </file>
@@ -16718,13 +16745,9 @@
 </file>
 
 <file path=customXml/itemProps3.xml><?xml version="1.0" encoding="utf-8"?>
-<ds:datastoreItem xmlns:ds="http://schemas.openxmlformats.org/officeDocument/2006/customXml" ds:itemID="{2FE68222-D1D7-4405-9D8B-445901EEA94E}">
+<ds:datastoreItem xmlns:ds="http://schemas.openxmlformats.org/officeDocument/2006/customXml" ds:itemID="{6A404842-743E-4BBC-99A7-70A911F17733}">
   <ds:schemaRefs>
-    <ds:schemaRef ds:uri="http://schemas.microsoft.com/office/2006/metadata/properties"/>
-    <ds:schemaRef ds:uri="http://schemas.microsoft.com/office/infopath/2007/PartnerControls"/>
-    <ds:schemaRef ds:uri="http://schemas.microsoft.com/sharepoint/v3"/>
-    <ds:schemaRef ds:uri="72f5c66d-4f9b-4523-9c59-0147434cba56"/>
-    <ds:schemaRef ds:uri="d5671106-6e7e-4942-8aee-9bcd5dd7e66b"/>
+    <ds:schemaRef ds:uri="http://schemas.openxmlformats.org/officeDocument/2006/bibliography"/>
   </ds:schemaRefs>
 </ds:datastoreItem>
 </file>

</xml_diff>

<commit_message>
Add 2 for rows in csv
</commit_message>
<xml_diff>
--- a/CA2_group_template.docx
+++ b/CA2_group_template.docx
@@ -91,7 +91,7 @@
           </mc:Choice>
           <mc:Fallback>
             <w:pict>
-              <v:rect w14:anchorId="442B718D" id="Rectangle 4" o:spid="_x0000_s1026" style="position:absolute;margin-left:-27.75pt;margin-top:-18.75pt;width:49.8pt;height:774.75pt;z-index:-251658240;visibility:visible;mso-wrap-style:square;mso-width-percent:0;mso-height-percent:0;mso-wrap-distance-left:9pt;mso-wrap-distance-top:0;mso-wrap-distance-right:9pt;mso-wrap-distance-bottom:0;mso-position-horizontal:absolute;mso-position-horizontal-relative:text;mso-position-vertical:absolute;mso-position-vertical-relative:text;mso-width-percent:0;mso-height-percent:0;mso-width-relative:margin;mso-height-relative:margin;v-text-anchor:middle" o:gfxdata="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" fillcolor="#92d050" stroked="f" strokeweight="2pt"/>
+              <v:rect w14:anchorId="137F0307" id="Rectangle 4" o:spid="_x0000_s1026" style="position:absolute;margin-left:-27.75pt;margin-top:-18.75pt;width:49.8pt;height:774.75pt;z-index:-251658240;visibility:visible;mso-wrap-style:square;mso-width-percent:0;mso-height-percent:0;mso-wrap-distance-left:9pt;mso-wrap-distance-top:0;mso-wrap-distance-right:9pt;mso-wrap-distance-bottom:0;mso-position-horizontal:absolute;mso-position-horizontal-relative:text;mso-position-vertical:absolute;mso-position-vertical-relative:text;mso-width-percent:0;mso-height-percent:0;mso-width-relative:margin;mso-height-relative:margin;v-text-anchor:middle" o:gfxdata="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" fillcolor="#92d050" stroked="f" strokeweight="2pt"/>
             </w:pict>
           </mc:Fallback>
         </mc:AlternateContent>
@@ -600,6 +600,7 @@
       </w:sdtPr>
       <w:sdtEndPr>
         <w:rPr>
+          <w:rFonts w:eastAsiaTheme="minorEastAsia"/>
           <w:noProof w:val="0"/>
         </w:rPr>
       </w:sdtEndPr>
@@ -959,11 +960,7 @@
               </mc:Choice>
               <mc:Fallback>
                 <w:pict>
-                  <v:shapetype w14:anchorId="613D5061" id="_x0000_t202" coordsize="21600,21600" o:spt="202" path="m,l,21600r21600,l21600,xe">
-                    <v:stroke joinstyle="miter"/>
-                    <v:path gradientshapeok="t" o:connecttype="rect"/>
-                  </v:shapetype>
-                  <v:shape id="Text Box 2" o:spid="_x0000_s1027" type="#_x0000_t202" style="position:absolute;margin-left:54pt;margin-top:343.7pt;width:424.2pt;height:189.6pt;z-index:251658244;visibility:visible;mso-wrap-style:square;mso-width-percent:0;mso-height-percent:0;mso-wrap-distance-left:9pt;mso-wrap-distance-top:3.6pt;mso-wrap-distance-right:9pt;mso-wrap-distance-bottom:3.6pt;mso-position-horizontal:absolute;mso-position-horizontal-relative:text;mso-position-vertical:absolute;mso-position-vertical-relative:text;mso-width-percent:0;mso-height-percent:0;mso-width-relative:margin;mso-height-relative:margin;v-text-anchor:top" o:gfxdata="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" filled="f" strokecolor="#4e6128 [1606]">
+                  <v:shape w14:anchorId="613D5061" id="Text Box 2" o:spid="_x0000_s1027" type="#_x0000_t202" style="position:absolute;margin-left:54pt;margin-top:343.7pt;width:424.2pt;height:189.6pt;z-index:251658244;visibility:visible;mso-wrap-style:square;mso-width-percent:0;mso-height-percent:0;mso-wrap-distance-left:9pt;mso-wrap-distance-top:3.6pt;mso-wrap-distance-right:9pt;mso-wrap-distance-bottom:3.6pt;mso-position-horizontal:absolute;mso-position-horizontal-relative:text;mso-position-vertical:absolute;mso-position-vertical-relative:text;mso-width-percent:0;mso-height-percent:0;mso-width-relative:margin;mso-height-relative:margin;v-text-anchor:top" o:gfxdata="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" filled="f" strokecolor="#4e6128 [1606]">
                     <v:stroke dashstyle="dash"/>
                     <v:textbox inset="3mm,3mm,3mm,3mm">
                       <w:txbxContent>
@@ -1627,11 +1624,7 @@
               </mc:Choice>
               <mc:Fallback>
                 <w:pict>
-                  <v:shapetype w14:anchorId="3D62382C" id="_x0000_t202" coordsize="21600,21600" o:spt="202" path="m,l,21600r21600,l21600,xe">
-                    <v:stroke joinstyle="miter"/>
-                    <v:path gradientshapeok="t" o:connecttype="rect"/>
-                  </v:shapetype>
-                  <v:shape id="Text Box 39" o:spid="_x0000_s1028" type="#_x0000_t202" style="position:absolute;margin-left:172.5pt;margin-top:156.75pt;width:367.35pt;height:230.25pt;z-index:251658243;visibility:visible;mso-wrap-style:square;mso-width-percent:0;mso-height-percent:0;mso-wrap-distance-left:9pt;mso-wrap-distance-top:0;mso-wrap-distance-right:9pt;mso-wrap-distance-bottom:0;mso-position-horizontal:absolute;mso-position-horizontal-relative:page;mso-position-vertical:absolute;mso-position-vertical-relative:page;mso-width-percent:0;mso-height-percent:0;mso-width-relative:page;mso-height-relative:margin;v-text-anchor:top" o:gfxdata="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" filled="f" stroked="f" strokeweight=".5pt">
+                  <v:shape w14:anchorId="3D62382C" id="Text Box 39" o:spid="_x0000_s1028" type="#_x0000_t202" style="position:absolute;margin-left:172.5pt;margin-top:156.75pt;width:367.35pt;height:230.25pt;z-index:251658243;visibility:visible;mso-wrap-style:square;mso-width-percent:0;mso-height-percent:0;mso-wrap-distance-left:9pt;mso-wrap-distance-top:0;mso-wrap-distance-right:9pt;mso-wrap-distance-bottom:0;mso-position-horizontal:absolute;mso-position-horizontal-relative:page;mso-position-vertical:absolute;mso-position-vertical-relative:page;mso-width-percent:0;mso-height-percent:0;mso-width-relative:page;mso-height-relative:margin;v-text-anchor:top" o:gfxdata="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" filled="f" stroked="f" strokeweight=".5pt">
                     <v:textbox inset="0,0,0,0">
                       <w:txbxContent>
                         <w:p>
@@ -2194,12 +2187,80 @@
             <w:pPr>
               <w:pStyle w:val="ListParagraph"/>
               <w:ind w:left="0"/>
+              <w:rPr>
+                <w:rFonts w:hint="eastAsia"/>
+                <w:lang w:eastAsia="zh-CN"/>
+              </w:rPr>
             </w:pPr>
             <w:r>
-              <w:t>9107, 12230, 12231, 12232, 12233, 12234</w:t>
+              <w:t>910</w:t>
             </w:r>
             <w:r>
-              <w:t>, 12235</w:t>
+              <w:rPr>
+                <w:rFonts w:hint="eastAsia"/>
+                <w:lang w:eastAsia="zh-CN"/>
+              </w:rPr>
+              <w:t>9</w:t>
+            </w:r>
+            <w:r>
+              <w:t>, 1223</w:t>
+            </w:r>
+            <w:r>
+              <w:rPr>
+                <w:rFonts w:hint="eastAsia"/>
+                <w:lang w:eastAsia="zh-CN"/>
+              </w:rPr>
+              <w:t>2</w:t>
+            </w:r>
+            <w:r>
+              <w:t>, 1223</w:t>
+            </w:r>
+            <w:r>
+              <w:rPr>
+                <w:rFonts w:hint="eastAsia"/>
+                <w:lang w:eastAsia="zh-CN"/>
+              </w:rPr>
+              <w:t>3</w:t>
+            </w:r>
+            <w:r>
+              <w:t>, 1223</w:t>
+            </w:r>
+            <w:r>
+              <w:rPr>
+                <w:rFonts w:hint="eastAsia"/>
+                <w:lang w:eastAsia="zh-CN"/>
+              </w:rPr>
+              <w:t>4</w:t>
+            </w:r>
+            <w:r>
+              <w:t>, 1223</w:t>
+            </w:r>
+            <w:r>
+              <w:rPr>
+                <w:rFonts w:hint="eastAsia"/>
+                <w:lang w:eastAsia="zh-CN"/>
+              </w:rPr>
+              <w:t>5</w:t>
+            </w:r>
+            <w:r>
+              <w:t>, 1223</w:t>
+            </w:r>
+            <w:r>
+              <w:rPr>
+                <w:rFonts w:hint="eastAsia"/>
+                <w:lang w:eastAsia="zh-CN"/>
+              </w:rPr>
+              <w:t>6</w:t>
+            </w:r>
+            <w:r>
+              <w:t>, 1223</w:t>
+            </w:r>
+            <w:r>
+              <w:rPr>
+                <w:rFonts w:hint="eastAsia"/>
+                <w:lang w:eastAsia="zh-CN"/>
+              </w:rPr>
+              <w:t>7</w:t>
             </w:r>
           </w:p>
         </w:tc>
@@ -2213,29 +2274,23 @@
               <w:ind w:left="0"/>
             </w:pPr>
             <w:r>
-              <w:t>The ‘</w:t>
-            </w:r>
-            <w:proofErr w:type="spellStart"/>
-            <w:r>
-              <w:t>LoanStatus</w:t>
-            </w:r>
-            <w:proofErr w:type="spellEnd"/>
-            <w:r>
-              <w:t xml:space="preserve">’ column </w:t>
+              <w:t xml:space="preserve">The ‘LoanStatus’ column </w:t>
             </w:r>
             <w:r>
               <w:t>had</w:t>
             </w:r>
             <w:r>
-              <w:t xml:space="preserve"> missing values. Additionally, row 9107 is missing its ‘</w:t>
+              <w:t xml:space="preserve"> missing values. Additionally, row 910</w:t>
             </w:r>
-            <w:proofErr w:type="spellStart"/>
             <w:r>
-              <w:t>ReturnedDatetime</w:t>
+              <w:rPr>
+                <w:rFonts w:hint="eastAsia"/>
+                <w:lang w:eastAsia="zh-CN"/>
+              </w:rPr>
+              <w:t>9</w:t>
             </w:r>
-            <w:proofErr w:type="spellEnd"/>
             <w:r>
-              <w:t>’ column.</w:t>
+              <w:t xml:space="preserve"> is missing its ‘ReturnedDatetime’ column.</w:t>
             </w:r>
           </w:p>
         </w:tc>
@@ -2249,29 +2304,23 @@
               <w:ind w:left="0"/>
             </w:pPr>
             <w:r>
-              <w:t xml:space="preserve">For row 9107, as we are unable to determine </w:t>
+              <w:t>For row 910</w:t>
             </w:r>
-            <w:proofErr w:type="spellStart"/>
             <w:r>
-              <w:t>ReturnDatetime</w:t>
+              <w:rPr>
+                <w:rFonts w:hint="eastAsia"/>
+                <w:lang w:eastAsia="zh-CN"/>
+              </w:rPr>
+              <w:t>9</w:t>
             </w:r>
-            <w:proofErr w:type="spellEnd"/>
             <w:r>
-              <w:t xml:space="preserve">. For the rest of the rows, we </w:t>
+              <w:t xml:space="preserve">, as we are unable to determine ReturnDatetime. For the rest of the rows, we </w:t>
             </w:r>
             <w:r>
               <w:t>corrected</w:t>
             </w:r>
             <w:r>
-              <w:t xml:space="preserve"> the value in ‘</w:t>
-            </w:r>
-            <w:proofErr w:type="spellStart"/>
-            <w:r>
-              <w:t>LoanStatus</w:t>
-            </w:r>
-            <w:proofErr w:type="spellEnd"/>
-            <w:r>
-              <w:t>’ to ‘Returned’.</w:t>
+              <w:t xml:space="preserve"> the value in ‘LoanStatus’ to ‘Returned’.</w:t>
             </w:r>
           </w:p>
         </w:tc>
@@ -2299,9 +2348,20 @@
             <w:pPr>
               <w:pStyle w:val="ListParagraph"/>
               <w:ind w:left="0"/>
+              <w:rPr>
+                <w:rFonts w:hint="eastAsia"/>
+                <w:lang w:eastAsia="zh-CN"/>
+              </w:rPr>
             </w:pPr>
             <w:r>
-              <w:t>196</w:t>
+              <w:t>19</w:t>
+            </w:r>
+            <w:r>
+              <w:rPr>
+                <w:rFonts w:hint="eastAsia"/>
+                <w:lang w:eastAsia="zh-CN"/>
+              </w:rPr>
+              <w:t>8</w:t>
             </w:r>
           </w:p>
         </w:tc>
@@ -2318,15 +2378,7 @@
               </w:rPr>
             </w:pPr>
             <w:r>
-              <w:t>The ‘</w:t>
-            </w:r>
-            <w:proofErr w:type="spellStart"/>
-            <w:r>
-              <w:t>TierID</w:t>
-            </w:r>
-            <w:proofErr w:type="spellEnd"/>
-            <w:r>
-              <w:t xml:space="preserve">’ column </w:t>
+              <w:t xml:space="preserve">The ‘TierID’ column </w:t>
             </w:r>
             <w:r>
               <w:t>was</w:t>
@@ -2352,15 +2404,7 @@
               <w:ind w:left="0"/>
             </w:pPr>
             <w:r>
-              <w:t>We corrected the ‘</w:t>
-            </w:r>
-            <w:proofErr w:type="spellStart"/>
-            <w:r>
-              <w:t>TierID</w:t>
-            </w:r>
-            <w:proofErr w:type="spellEnd"/>
-            <w:r>
-              <w:t>’ column back to ‘T0001’</w:t>
+              <w:t>We corrected the ‘TierID’ column back to ‘T0001’</w:t>
             </w:r>
           </w:p>
         </w:tc>
@@ -2388,9 +2432,50 @@
             <w:pPr>
               <w:pStyle w:val="ListParagraph"/>
               <w:ind w:left="0"/>
+              <w:rPr>
+                <w:rFonts w:hint="eastAsia"/>
+                <w:lang w:eastAsia="zh-CN"/>
+              </w:rPr>
             </w:pPr>
             <w:r>
-              <w:t>1173, 1186, 1123, 1240</w:t>
+              <w:t>117</w:t>
+            </w:r>
+            <w:r>
+              <w:rPr>
+                <w:rFonts w:hint="eastAsia"/>
+                <w:lang w:eastAsia="zh-CN"/>
+              </w:rPr>
+              <w:t>5</w:t>
+            </w:r>
+            <w:r>
+              <w:t>, 118</w:t>
+            </w:r>
+            <w:r>
+              <w:rPr>
+                <w:rFonts w:hint="eastAsia"/>
+                <w:lang w:eastAsia="zh-CN"/>
+              </w:rPr>
+              <w:t>8</w:t>
+            </w:r>
+            <w:r>
+              <w:t>, 112</w:t>
+            </w:r>
+            <w:r>
+              <w:rPr>
+                <w:rFonts w:hint="eastAsia"/>
+                <w:lang w:eastAsia="zh-CN"/>
+              </w:rPr>
+              <w:t>5</w:t>
+            </w:r>
+            <w:r>
+              <w:t>, 124</w:t>
+            </w:r>
+            <w:r>
+              <w:rPr>
+                <w:rFonts w:hint="eastAsia"/>
+                <w:lang w:eastAsia="zh-CN"/>
+              </w:rPr>
+              <w:t>2</w:t>
             </w:r>
           </w:p>
         </w:tc>
@@ -2404,15 +2489,7 @@
               <w:ind w:left="0"/>
             </w:pPr>
             <w:r>
-              <w:t>The ‘Status’ column was recorded as ‘</w:t>
-            </w:r>
-            <w:proofErr w:type="spellStart"/>
-            <w:r>
-              <w:t>Availble</w:t>
-            </w:r>
-            <w:proofErr w:type="spellEnd"/>
-            <w:r>
-              <w:t>’</w:t>
+              <w:t>The ‘Status’ column was recorded as ‘Availble’</w:t>
             </w:r>
           </w:p>
         </w:tc>
@@ -2454,9 +2531,20 @@
             <w:pPr>
               <w:pStyle w:val="ListParagraph"/>
               <w:ind w:left="0"/>
+              <w:rPr>
+                <w:rFonts w:hint="eastAsia"/>
+                <w:lang w:eastAsia="zh-CN"/>
+              </w:rPr>
             </w:pPr>
             <w:r>
-              <w:t>387</w:t>
+              <w:t>38</w:t>
+            </w:r>
+            <w:r>
+              <w:rPr>
+                <w:rFonts w:hint="eastAsia"/>
+                <w:lang w:eastAsia="zh-CN"/>
+              </w:rPr>
+              <w:t>9</w:t>
             </w:r>
           </w:p>
         </w:tc>
@@ -2470,15 +2558,7 @@
               <w:ind w:left="0"/>
             </w:pPr>
             <w:r>
-              <w:t>The ‘</w:t>
-            </w:r>
-            <w:proofErr w:type="spellStart"/>
-            <w:r>
-              <w:t>StaffID</w:t>
-            </w:r>
-            <w:proofErr w:type="spellEnd"/>
-            <w:r>
-              <w:t>’ column has been recorded as ‘S0101’</w:t>
+              <w:t>The ‘StaffID’ column has been recorded as ‘S0101’</w:t>
             </w:r>
           </w:p>
         </w:tc>
@@ -2492,15 +2572,7 @@
               <w:ind w:left="0"/>
             </w:pPr>
             <w:r>
-              <w:t>We corrected the ‘</w:t>
-            </w:r>
-            <w:proofErr w:type="spellStart"/>
-            <w:r>
-              <w:t>StaffID</w:t>
-            </w:r>
-            <w:proofErr w:type="spellEnd"/>
-            <w:r>
-              <w:t>’ column to ‘S0001’</w:t>
+              <w:t>We corrected the ‘StaffID’ column to ‘S0001’</w:t>
             </w:r>
           </w:p>
         </w:tc>
@@ -2528,9 +2600,20 @@
             <w:pPr>
               <w:pStyle w:val="ListParagraph"/>
               <w:ind w:left="0"/>
+              <w:rPr>
+                <w:rFonts w:hint="eastAsia"/>
+                <w:lang w:eastAsia="zh-CN"/>
+              </w:rPr>
             </w:pPr>
             <w:r>
-              <w:t>300</w:t>
+              <w:t>30</w:t>
+            </w:r>
+            <w:r>
+              <w:rPr>
+                <w:rFonts w:hint="eastAsia"/>
+                <w:lang w:eastAsia="zh-CN"/>
+              </w:rPr>
+              <w:t>2</w:t>
             </w:r>
           </w:p>
         </w:tc>
@@ -2544,15 +2627,7 @@
               <w:ind w:left="0"/>
             </w:pPr>
             <w:r>
-              <w:t>The ‘</w:t>
-            </w:r>
-            <w:proofErr w:type="spellStart"/>
-            <w:r>
-              <w:t>DateOfBirth</w:t>
-            </w:r>
-            <w:proofErr w:type="spellEnd"/>
-            <w:r>
-              <w:t>’ column was null.</w:t>
+              <w:t>The ‘DateOfBirth’ column was null.</w:t>
             </w:r>
           </w:p>
         </w:tc>
@@ -2566,15 +2641,7 @@
               <w:ind w:left="0"/>
             </w:pPr>
             <w:r>
-              <w:t>We corrected the ‘</w:t>
-            </w:r>
-            <w:proofErr w:type="spellStart"/>
-            <w:r>
-              <w:t>DateOfBirth</w:t>
-            </w:r>
-            <w:proofErr w:type="spellEnd"/>
-            <w:r>
-              <w:t xml:space="preserve">’ column to </w:t>
+              <w:t xml:space="preserve">We corrected the ‘DateOfBirth’ column to </w:t>
             </w:r>
             <w:r>
               <w:t>‘</w:t>
@@ -2586,15 +2653,7 @@
               <w:t>’</w:t>
             </w:r>
             <w:r>
-              <w:t xml:space="preserve"> using </w:t>
-            </w:r>
-            <w:proofErr w:type="spellStart"/>
-            <w:r>
-              <w:t>pd.to_datetime</w:t>
-            </w:r>
-            <w:proofErr w:type="spellEnd"/>
-            <w:r>
-              <w:t xml:space="preserve">. </w:t>
+              <w:t xml:space="preserve"> using pd.to_datetime. </w:t>
             </w:r>
           </w:p>
         </w:tc>
@@ -2622,9 +2681,20 @@
             <w:pPr>
               <w:pStyle w:val="ListParagraph"/>
               <w:ind w:left="0"/>
+              <w:rPr>
+                <w:rFonts w:hint="eastAsia"/>
+                <w:lang w:eastAsia="zh-CN"/>
+              </w:rPr>
             </w:pPr>
             <w:r>
-              <w:t>27</w:t>
+              <w:t>2</w:t>
+            </w:r>
+            <w:r>
+              <w:rPr>
+                <w:rFonts w:hint="eastAsia"/>
+                <w:lang w:eastAsia="zh-CN"/>
+              </w:rPr>
+              <w:t>9</w:t>
             </w:r>
           </w:p>
         </w:tc>
@@ -2655,13 +2725,8 @@
               <w:t xml:space="preserve">We corrected the ‘StartDateTime’ column to </w:t>
             </w:r>
             <w:r>
-              <w:t xml:space="preserve">‘2/18/2011 13:55’ using </w:t>
+              <w:t>‘2/18/2011 13:55’ using pd.to_datetime</w:t>
             </w:r>
-            <w:proofErr w:type="spellStart"/>
-            <w:r>
-              <w:t>pd.to_datetime</w:t>
-            </w:r>
-            <w:proofErr w:type="spellEnd"/>
           </w:p>
         </w:tc>
       </w:tr>
@@ -2676,15 +2741,7 @@
         <w:pStyle w:val="ListParagraph"/>
       </w:pPr>
       <w:r>
-        <w:t xml:space="preserve">Submit your SQL INSERT statements for data insertion to the OLTP tables in </w:t>
-      </w:r>
-      <w:proofErr w:type="spellStart"/>
-      <w:r>
-        <w:t>OLTP_insert.sql</w:t>
-      </w:r>
-      <w:proofErr w:type="spellEnd"/>
-      <w:r>
-        <w:t>. If you apply bulk loading, submit each of the cleaned data files used during insertion as well.</w:t>
+        <w:t>Submit your SQL INSERT statements for data insertion to the OLTP tables in OLTP_insert.sql. If you apply bulk loading, submit each of the cleaned data files used during insertion as well.</w:t>
       </w:r>
     </w:p>
     <w:p>
@@ -2825,77 +2882,7 @@
                               <w:rPr>
                                 <w:lang w:val="en-SG"/>
                               </w:rPr>
-                              <w:t xml:space="preserve">INSERT INTO </w:t>
-                            </w:r>
-                            <w:proofErr w:type="spellStart"/>
-                            <w:r>
-                              <w:rPr>
-                                <w:lang w:val="en-SG"/>
-                              </w:rPr>
-                              <w:t>MembershipTier</w:t>
-                            </w:r>
-                            <w:proofErr w:type="spellEnd"/>
-                            <w:r>
-                              <w:rPr>
-                                <w:lang w:val="en-SG"/>
-                              </w:rPr>
-                              <w:t xml:space="preserve"> (</w:t>
-                            </w:r>
-                            <w:proofErr w:type="spellStart"/>
-                            <w:r>
-                              <w:rPr>
-                                <w:lang w:val="en-SG"/>
-                              </w:rPr>
-                              <w:t>TierID</w:t>
-                            </w:r>
-                            <w:proofErr w:type="spellEnd"/>
-                            <w:r>
-                              <w:rPr>
-                                <w:lang w:val="en-SG"/>
-                              </w:rPr>
-                              <w:t xml:space="preserve">, </w:t>
-                            </w:r>
-                            <w:proofErr w:type="spellStart"/>
-                            <w:r>
-                              <w:rPr>
-                                <w:lang w:val="en-SG"/>
-                              </w:rPr>
-                              <w:t>TierName</w:t>
-                            </w:r>
-                            <w:proofErr w:type="spellEnd"/>
-                            <w:r>
-                              <w:rPr>
-                                <w:lang w:val="en-SG"/>
-                              </w:rPr>
-                              <w:t xml:space="preserve">, </w:t>
-                            </w:r>
-                            <w:proofErr w:type="spellStart"/>
-                            <w:r>
-                              <w:rPr>
-                                <w:lang w:val="en-SG"/>
-                              </w:rPr>
-                              <w:t>TierLevel</w:t>
-                            </w:r>
-                            <w:proofErr w:type="spellEnd"/>
-                            <w:r>
-                              <w:rPr>
-                                <w:lang w:val="en-SG"/>
-                              </w:rPr>
-                              <w:t xml:space="preserve">, </w:t>
-                            </w:r>
-                            <w:proofErr w:type="spellStart"/>
-                            <w:r>
-                              <w:rPr>
-                                <w:lang w:val="en-SG"/>
-                              </w:rPr>
-                              <w:t>BorrowLimit</w:t>
-                            </w:r>
-                            <w:proofErr w:type="spellEnd"/>
-                            <w:r>
-                              <w:rPr>
-                                <w:lang w:val="en-SG"/>
-                              </w:rPr>
-                              <w:t>)</w:t>
+                              <w:t>INSERT INTO MembershipTier (TierID, TierName, TierLevel, BorrowLimit)</w:t>
                             </w:r>
                           </w:p>
                           <w:p>
@@ -2947,21 +2934,7 @@
                               <w:rPr>
                                 <w:lang w:val="en-SG"/>
                               </w:rPr>
-                              <w:t>       ('T9999', '</w:t>
-                            </w:r>
-                            <w:proofErr w:type="spellStart"/>
-                            <w:r>
-                              <w:rPr>
-                                <w:lang w:val="en-SG"/>
-                              </w:rPr>
-                              <w:t>SuperAdmin</w:t>
-                            </w:r>
-                            <w:proofErr w:type="spellEnd"/>
-                            <w:r>
-                              <w:rPr>
-                                <w:lang w:val="en-SG"/>
-                              </w:rPr>
-                              <w:t>', 9999, 9999);</w:t>
+                              <w:t>       ('T9999', 'SuperAdmin', 9999, 9999);</w:t>
                             </w:r>
                           </w:p>
                           <w:p>
@@ -3249,16 +3222,8 @@
                               <w:rPr>
                                 <w:lang w:val="en-SG"/>
                               </w:rPr>
-                              <w:t xml:space="preserve">INTO TABLE </w:t>
+                              <w:t>INTO TABLE BookCopy</w:t>
                             </w:r>
-                            <w:proofErr w:type="spellStart"/>
-                            <w:r>
-                              <w:rPr>
-                                <w:lang w:val="en-SG"/>
-                              </w:rPr>
-                              <w:t>BookCopy</w:t>
-                            </w:r>
-                            <w:proofErr w:type="spellEnd"/>
                           </w:p>
                           <w:p>
                             <w:pPr>
@@ -3465,11 +3430,7 @@
           </mc:Choice>
           <mc:Fallback>
             <w:pict>
-              <v:shapetype w14:anchorId="0AD4021C" id="_x0000_t202" coordsize="21600,21600" o:spt="202" path="m,l,21600r21600,l21600,xe">
-                <v:stroke joinstyle="miter"/>
-                <v:path gradientshapeok="t" o:connecttype="rect"/>
-              </v:shapetype>
-              <v:shape id="_x0000_s1030" type="#_x0000_t202" style="position:absolute;left:0;text-align:left;margin-left:38pt;margin-top:1.45pt;width:432.6pt;height:694.5pt;z-index:251660292;visibility:visible;mso-wrap-style:square;mso-width-percent:0;mso-height-percent:0;mso-wrap-distance-left:9pt;mso-wrap-distance-top:3.6pt;mso-wrap-distance-right:9pt;mso-wrap-distance-bottom:3.6pt;mso-position-horizontal:absolute;mso-position-horizontal-relative:text;mso-position-vertical:absolute;mso-position-vertical-relative:text;mso-width-percent:0;mso-height-percent:0;mso-width-relative:margin;mso-height-relative:margin;v-text-anchor:top" o:gfxdata="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">
+              <v:shape w14:anchorId="0AD4021C" id="_x0000_s1030" type="#_x0000_t202" style="position:absolute;left:0;text-align:left;margin-left:38pt;margin-top:1.45pt;width:432.6pt;height:694.5pt;z-index:251660292;visibility:visible;mso-wrap-style:square;mso-width-percent:0;mso-height-percent:0;mso-wrap-distance-left:9pt;mso-wrap-distance-top:3.6pt;mso-wrap-distance-right:9pt;mso-wrap-distance-bottom:3.6pt;mso-position-horizontal:absolute;mso-position-horizontal-relative:text;mso-position-vertical:absolute;mso-position-vertical-relative:text;mso-width-percent:0;mso-height-percent:0;mso-width-relative:margin;mso-height-relative:margin;v-text-anchor:top" o:gfxdata="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">
                 <v:textbox>
                   <w:txbxContent>
                     <w:p>
@@ -3489,77 +3450,7 @@
                         <w:rPr>
                           <w:lang w:val="en-SG"/>
                         </w:rPr>
-                        <w:t xml:space="preserve">INSERT INTO </w:t>
-                      </w:r>
-                      <w:proofErr w:type="spellStart"/>
-                      <w:r>
-                        <w:rPr>
-                          <w:lang w:val="en-SG"/>
-                        </w:rPr>
-                        <w:t>MembershipTier</w:t>
-                      </w:r>
-                      <w:proofErr w:type="spellEnd"/>
-                      <w:r>
-                        <w:rPr>
-                          <w:lang w:val="en-SG"/>
-                        </w:rPr>
-                        <w:t xml:space="preserve"> (</w:t>
-                      </w:r>
-                      <w:proofErr w:type="spellStart"/>
-                      <w:r>
-                        <w:rPr>
-                          <w:lang w:val="en-SG"/>
-                        </w:rPr>
-                        <w:t>TierID</w:t>
-                      </w:r>
-                      <w:proofErr w:type="spellEnd"/>
-                      <w:r>
-                        <w:rPr>
-                          <w:lang w:val="en-SG"/>
-                        </w:rPr>
-                        <w:t xml:space="preserve">, </w:t>
-                      </w:r>
-                      <w:proofErr w:type="spellStart"/>
-                      <w:r>
-                        <w:rPr>
-                          <w:lang w:val="en-SG"/>
-                        </w:rPr>
-                        <w:t>TierName</w:t>
-                      </w:r>
-                      <w:proofErr w:type="spellEnd"/>
-                      <w:r>
-                        <w:rPr>
-                          <w:lang w:val="en-SG"/>
-                        </w:rPr>
-                        <w:t xml:space="preserve">, </w:t>
-                      </w:r>
-                      <w:proofErr w:type="spellStart"/>
-                      <w:r>
-                        <w:rPr>
-                          <w:lang w:val="en-SG"/>
-                        </w:rPr>
-                        <w:t>TierLevel</w:t>
-                      </w:r>
-                      <w:proofErr w:type="spellEnd"/>
-                      <w:r>
-                        <w:rPr>
-                          <w:lang w:val="en-SG"/>
-                        </w:rPr>
-                        <w:t xml:space="preserve">, </w:t>
-                      </w:r>
-                      <w:proofErr w:type="spellStart"/>
-                      <w:r>
-                        <w:rPr>
-                          <w:lang w:val="en-SG"/>
-                        </w:rPr>
-                        <w:t>BorrowLimit</w:t>
-                      </w:r>
-                      <w:proofErr w:type="spellEnd"/>
-                      <w:r>
-                        <w:rPr>
-                          <w:lang w:val="en-SG"/>
-                        </w:rPr>
-                        <w:t>)</w:t>
+                        <w:t>INSERT INTO MembershipTier (TierID, TierName, TierLevel, BorrowLimit)</w:t>
                       </w:r>
                     </w:p>
                     <w:p>
@@ -3611,21 +3502,7 @@
                         <w:rPr>
                           <w:lang w:val="en-SG"/>
                         </w:rPr>
-                        <w:t>       ('T9999', '</w:t>
-                      </w:r>
-                      <w:proofErr w:type="spellStart"/>
-                      <w:r>
-                        <w:rPr>
-                          <w:lang w:val="en-SG"/>
-                        </w:rPr>
-                        <w:t>SuperAdmin</w:t>
-                      </w:r>
-                      <w:proofErr w:type="spellEnd"/>
-                      <w:r>
-                        <w:rPr>
-                          <w:lang w:val="en-SG"/>
-                        </w:rPr>
-                        <w:t>', 9999, 9999);</w:t>
+                        <w:t>       ('T9999', 'SuperAdmin', 9999, 9999);</w:t>
                       </w:r>
                     </w:p>
                     <w:p>
@@ -3913,16 +3790,8 @@
                         <w:rPr>
                           <w:lang w:val="en-SG"/>
                         </w:rPr>
-                        <w:t xml:space="preserve">INTO TABLE </w:t>
+                        <w:t>INTO TABLE BookCopy</w:t>
                       </w:r>
-                      <w:proofErr w:type="spellStart"/>
-                      <w:r>
-                        <w:rPr>
-                          <w:lang w:val="en-SG"/>
-                        </w:rPr>
-                        <w:t>BookCopy</w:t>
-                      </w:r>
-                      <w:proofErr w:type="spellEnd"/>
                     </w:p>
                     <w:p>
                       <w:pPr>
@@ -4288,37 +4157,13 @@
       </w:pPr>
       <w:r>
         <w:lastRenderedPageBreak/>
-        <w:t xml:space="preserve">Submit your </w:t>
-      </w:r>
-      <w:proofErr w:type="gramStart"/>
-      <w:r>
-        <w:t>CREATE table</w:t>
-      </w:r>
-      <w:proofErr w:type="gramEnd"/>
-      <w:r>
-        <w:t xml:space="preserve"> statements for DW table creations in </w:t>
-      </w:r>
-      <w:proofErr w:type="spellStart"/>
-      <w:r>
-        <w:t>DW_create.sql</w:t>
-      </w:r>
-      <w:proofErr w:type="spellEnd"/>
-      <w:r>
-        <w:t xml:space="preserve">. Use appropriate SQL statements to extract and load data from OLTP tables to the </w:t>
+        <w:t xml:space="preserve">Submit your CREATE table statements for DW table creations in DW_create.sql. Use appropriate SQL statements to extract and load data from OLTP tables to the </w:t>
       </w:r>
       <w:r>
         <w:t>DW and</w:t>
       </w:r>
       <w:r>
-        <w:t xml:space="preserve"> submit all your queries in </w:t>
-      </w:r>
-      <w:proofErr w:type="spellStart"/>
-      <w:r>
-        <w:t>DW_insert.sql</w:t>
-      </w:r>
-      <w:proofErr w:type="spellEnd"/>
-      <w:r>
-        <w:t>.</w:t>
+        <w:t xml:space="preserve"> submit all your queries in DW_insert.sql.</w:t>
       </w:r>
     </w:p>
     <w:bookmarkEnd w:id="1"/>
@@ -4420,25 +4265,7 @@
                                 <w:szCs w:val="14"/>
                                 <w:lang w:val="en-SG"/>
                               </w:rPr>
-                              <w:t xml:space="preserve">CREATE TABLE </w:t>
-                            </w:r>
-                            <w:proofErr w:type="spellStart"/>
-                            <w:r>
-                              <w:rPr>
-                                <w:sz w:val="14"/>
-                                <w:szCs w:val="14"/>
-                                <w:lang w:val="en-SG"/>
-                              </w:rPr>
-                              <w:t>MembershipTier</w:t>
-                            </w:r>
-                            <w:proofErr w:type="spellEnd"/>
-                            <w:r>
-                              <w:rPr>
-                                <w:sz w:val="14"/>
-                                <w:szCs w:val="14"/>
-                                <w:lang w:val="en-SG"/>
-                              </w:rPr>
-                              <w:t xml:space="preserve"> (</w:t>
+                              <w:t>CREATE TABLE MembershipTier (</w:t>
                             </w:r>
                           </w:p>
                           <w:p>
@@ -4455,43 +4282,7 @@
                                 <w:szCs w:val="14"/>
                                 <w:lang w:val="en-SG"/>
                               </w:rPr>
-                              <w:t xml:space="preserve">    </w:t>
-                            </w:r>
-                            <w:proofErr w:type="spellStart"/>
-                            <w:r>
-                              <w:rPr>
-                                <w:sz w:val="14"/>
-                                <w:szCs w:val="14"/>
-                                <w:lang w:val="en-SG"/>
-                              </w:rPr>
-                              <w:t>TierID</w:t>
-                            </w:r>
-                            <w:proofErr w:type="spellEnd"/>
-                            <w:r>
-                              <w:rPr>
-                                <w:sz w:val="14"/>
-                                <w:szCs w:val="14"/>
-                                <w:lang w:val="en-SG"/>
-                              </w:rPr>
-                              <w:t xml:space="preserve"> </w:t>
-                            </w:r>
-                            <w:proofErr w:type="gramStart"/>
-                            <w:r>
-                              <w:rPr>
-                                <w:sz w:val="14"/>
-                                <w:szCs w:val="14"/>
-                                <w:lang w:val="en-SG"/>
-                              </w:rPr>
-                              <w:t>CHAR(</w:t>
-                            </w:r>
-                            <w:proofErr w:type="gramEnd"/>
-                            <w:r>
-                              <w:rPr>
-                                <w:sz w:val="14"/>
-                                <w:szCs w:val="14"/>
-                                <w:lang w:val="en-SG"/>
-                              </w:rPr>
-                              <w:t>10) PRIMARY KEY,</w:t>
+                              <w:t>    TierID CHAR(10) PRIMARY KEY,</w:t>
                             </w:r>
                           </w:p>
                           <w:p>
@@ -4508,43 +4299,7 @@
                                 <w:szCs w:val="14"/>
                                 <w:lang w:val="en-SG"/>
                               </w:rPr>
-                              <w:t xml:space="preserve">    </w:t>
-                            </w:r>
-                            <w:proofErr w:type="spellStart"/>
-                            <w:r>
-                              <w:rPr>
-                                <w:sz w:val="14"/>
-                                <w:szCs w:val="14"/>
-                                <w:lang w:val="en-SG"/>
-                              </w:rPr>
-                              <w:t>TierName</w:t>
-                            </w:r>
-                            <w:proofErr w:type="spellEnd"/>
-                            <w:r>
-                              <w:rPr>
-                                <w:sz w:val="14"/>
-                                <w:szCs w:val="14"/>
-                                <w:lang w:val="en-SG"/>
-                              </w:rPr>
-                              <w:t xml:space="preserve"> </w:t>
-                            </w:r>
-                            <w:proofErr w:type="gramStart"/>
-                            <w:r>
-                              <w:rPr>
-                                <w:sz w:val="14"/>
-                                <w:szCs w:val="14"/>
-                                <w:lang w:val="en-SG"/>
-                              </w:rPr>
-                              <w:t>VARCHAR(</w:t>
-                            </w:r>
-                            <w:proofErr w:type="gramEnd"/>
-                            <w:r>
-                              <w:rPr>
-                                <w:sz w:val="14"/>
-                                <w:szCs w:val="14"/>
-                                <w:lang w:val="en-SG"/>
-                              </w:rPr>
-                              <w:t>20) NOT NULL,</w:t>
+                              <w:t>    TierName VARCHAR(20) NOT NULL,</w:t>
                             </w:r>
                           </w:p>
                           <w:p>
@@ -4561,25 +4316,7 @@
                                 <w:szCs w:val="14"/>
                                 <w:lang w:val="en-SG"/>
                               </w:rPr>
-                              <w:t xml:space="preserve">    </w:t>
-                            </w:r>
-                            <w:proofErr w:type="spellStart"/>
-                            <w:r>
-                              <w:rPr>
-                                <w:sz w:val="14"/>
-                                <w:szCs w:val="14"/>
-                                <w:lang w:val="en-SG"/>
-                              </w:rPr>
-                              <w:t>TierLevel</w:t>
-                            </w:r>
-                            <w:proofErr w:type="spellEnd"/>
-                            <w:r>
-                              <w:rPr>
-                                <w:sz w:val="14"/>
-                                <w:szCs w:val="14"/>
-                                <w:lang w:val="en-SG"/>
-                              </w:rPr>
-                              <w:t xml:space="preserve"> INT NOT NULL,</w:t>
+                              <w:t>    TierLevel INT NOT NULL,</w:t>
                             </w:r>
                           </w:p>
                           <w:p>
@@ -4596,25 +4333,7 @@
                                 <w:szCs w:val="14"/>
                                 <w:lang w:val="en-SG"/>
                               </w:rPr>
-                              <w:t xml:space="preserve">    </w:t>
-                            </w:r>
-                            <w:proofErr w:type="spellStart"/>
-                            <w:r>
-                              <w:rPr>
-                                <w:sz w:val="14"/>
-                                <w:szCs w:val="14"/>
-                                <w:lang w:val="en-SG"/>
-                              </w:rPr>
-                              <w:t>BorrowLimit</w:t>
-                            </w:r>
-                            <w:proofErr w:type="spellEnd"/>
-                            <w:r>
-                              <w:rPr>
-                                <w:sz w:val="14"/>
-                                <w:szCs w:val="14"/>
-                                <w:lang w:val="en-SG"/>
-                              </w:rPr>
-                              <w:t xml:space="preserve"> INT NOT NULL</w:t>
+                              <w:t>    BorrowLimit INT NOT NULL</w:t>
                             </w:r>
                           </w:p>
                           <w:p>
@@ -4674,43 +4393,7 @@
                                 <w:szCs w:val="14"/>
                                 <w:lang w:val="en-SG"/>
                               </w:rPr>
-                              <w:t xml:space="preserve">    </w:t>
-                            </w:r>
-                            <w:proofErr w:type="spellStart"/>
-                            <w:r>
-                              <w:rPr>
-                                <w:sz w:val="14"/>
-                                <w:szCs w:val="14"/>
-                                <w:lang w:val="en-SG"/>
-                              </w:rPr>
-                              <w:t>MemberID</w:t>
-                            </w:r>
-                            <w:proofErr w:type="spellEnd"/>
-                            <w:r>
-                              <w:rPr>
-                                <w:sz w:val="14"/>
-                                <w:szCs w:val="14"/>
-                                <w:lang w:val="en-SG"/>
-                              </w:rPr>
-                              <w:t xml:space="preserve"> </w:t>
-                            </w:r>
-                            <w:proofErr w:type="gramStart"/>
-                            <w:r>
-                              <w:rPr>
-                                <w:sz w:val="14"/>
-                                <w:szCs w:val="14"/>
-                                <w:lang w:val="en-SG"/>
-                              </w:rPr>
-                              <w:t>CHAR(</w:t>
-                            </w:r>
-                            <w:proofErr w:type="gramEnd"/>
-                            <w:r>
-                              <w:rPr>
-                                <w:sz w:val="14"/>
-                                <w:szCs w:val="14"/>
-                                <w:lang w:val="en-SG"/>
-                              </w:rPr>
-                              <w:t>10) PRIMARY KEY,</w:t>
+                              <w:t>    MemberID CHAR(10) PRIMARY KEY,</w:t>
                             </w:r>
                           </w:p>
                           <w:p>
@@ -4727,25 +4410,7 @@
                                 <w:szCs w:val="14"/>
                                 <w:lang w:val="en-SG"/>
                               </w:rPr>
-                              <w:t xml:space="preserve">    Name </w:t>
-                            </w:r>
-                            <w:proofErr w:type="gramStart"/>
-                            <w:r>
-                              <w:rPr>
-                                <w:sz w:val="14"/>
-                                <w:szCs w:val="14"/>
-                                <w:lang w:val="en-SG"/>
-                              </w:rPr>
-                              <w:t>VARCHAR(</w:t>
-                            </w:r>
-                            <w:proofErr w:type="gramEnd"/>
-                            <w:r>
-                              <w:rPr>
-                                <w:sz w:val="14"/>
-                                <w:szCs w:val="14"/>
-                                <w:lang w:val="en-SG"/>
-                              </w:rPr>
-                              <w:t>100) NOT NULL,</w:t>
+                              <w:t>    Name VARCHAR(100) NOT NULL,</w:t>
                             </w:r>
                           </w:p>
                           <w:p>
@@ -4762,25 +4427,7 @@
                                 <w:szCs w:val="14"/>
                                 <w:lang w:val="en-SG"/>
                               </w:rPr>
-                              <w:t xml:space="preserve">    Contact </w:t>
-                            </w:r>
-                            <w:proofErr w:type="gramStart"/>
-                            <w:r>
-                              <w:rPr>
-                                <w:sz w:val="14"/>
-                                <w:szCs w:val="14"/>
-                                <w:lang w:val="en-SG"/>
-                              </w:rPr>
-                              <w:t>VARCHAR(</w:t>
-                            </w:r>
-                            <w:proofErr w:type="gramEnd"/>
-                            <w:r>
-                              <w:rPr>
-                                <w:sz w:val="14"/>
-                                <w:szCs w:val="14"/>
-                                <w:lang w:val="en-SG"/>
-                              </w:rPr>
-                              <w:t>100) NOT NULL,</w:t>
+                              <w:t>    Contact VARCHAR(100) NOT NULL,</w:t>
                             </w:r>
                           </w:p>
                           <w:p>
@@ -4814,25 +4461,7 @@
                                 <w:szCs w:val="14"/>
                                 <w:lang w:val="en-SG"/>
                               </w:rPr>
-                              <w:t xml:space="preserve">    Gender </w:t>
-                            </w:r>
-                            <w:proofErr w:type="gramStart"/>
-                            <w:r>
-                              <w:rPr>
-                                <w:sz w:val="14"/>
-                                <w:szCs w:val="14"/>
-                                <w:lang w:val="en-SG"/>
-                              </w:rPr>
-                              <w:t>CHAR(</w:t>
-                            </w:r>
-                            <w:proofErr w:type="gramEnd"/>
-                            <w:r>
-                              <w:rPr>
-                                <w:sz w:val="14"/>
-                                <w:szCs w:val="14"/>
-                                <w:lang w:val="en-SG"/>
-                              </w:rPr>
-                              <w:t>1) NOT NULL,</w:t>
+                              <w:t>    Gender CHAR(1) NOT NULL,</w:t>
                             </w:r>
                           </w:p>
                           <w:p>
@@ -4849,25 +4478,7 @@
                                 <w:szCs w:val="14"/>
                                 <w:lang w:val="en-SG"/>
                               </w:rPr>
-                              <w:t xml:space="preserve">    Occupation </w:t>
-                            </w:r>
-                            <w:proofErr w:type="gramStart"/>
-                            <w:r>
-                              <w:rPr>
-                                <w:sz w:val="14"/>
-                                <w:szCs w:val="14"/>
-                                <w:lang w:val="en-SG"/>
-                              </w:rPr>
-                              <w:t>VARCHAR(</w:t>
-                            </w:r>
-                            <w:proofErr w:type="gramEnd"/>
-                            <w:r>
-                              <w:rPr>
-                                <w:sz w:val="14"/>
-                                <w:szCs w:val="14"/>
-                                <w:lang w:val="en-SG"/>
-                              </w:rPr>
-                              <w:t>50) NULL,</w:t>
+                              <w:t>    Occupation VARCHAR(50) NULL,</w:t>
                             </w:r>
                           </w:p>
                           <w:p>
@@ -4884,25 +4495,7 @@
                                 <w:szCs w:val="14"/>
                                 <w:lang w:val="en-SG"/>
                               </w:rPr>
-                              <w:t xml:space="preserve">    </w:t>
-                            </w:r>
-                            <w:proofErr w:type="spellStart"/>
-                            <w:r>
-                              <w:rPr>
-                                <w:sz w:val="14"/>
-                                <w:szCs w:val="14"/>
-                                <w:lang w:val="en-SG"/>
-                              </w:rPr>
-                              <w:t>RegistrationDatetime</w:t>
-                            </w:r>
-                            <w:proofErr w:type="spellEnd"/>
-                            <w:r>
-                              <w:rPr>
-                                <w:sz w:val="14"/>
-                                <w:szCs w:val="14"/>
-                                <w:lang w:val="en-SG"/>
-                              </w:rPr>
-                              <w:t xml:space="preserve"> DATETIME NOT NULL,</w:t>
+                              <w:t>    RegistrationDatetime DATETIME NOT NULL,</w:t>
                             </w:r>
                           </w:p>
                           <w:p>
@@ -4919,43 +4512,7 @@
                                 <w:szCs w:val="14"/>
                                 <w:lang w:val="en-SG"/>
                               </w:rPr>
-                              <w:t xml:space="preserve">    </w:t>
-                            </w:r>
-                            <w:proofErr w:type="spellStart"/>
-                            <w:r>
-                              <w:rPr>
-                                <w:sz w:val="14"/>
-                                <w:szCs w:val="14"/>
-                                <w:lang w:val="en-SG"/>
-                              </w:rPr>
-                              <w:t>TierID</w:t>
-                            </w:r>
-                            <w:proofErr w:type="spellEnd"/>
-                            <w:r>
-                              <w:rPr>
-                                <w:sz w:val="14"/>
-                                <w:szCs w:val="14"/>
-                                <w:lang w:val="en-SG"/>
-                              </w:rPr>
-                              <w:t xml:space="preserve"> </w:t>
-                            </w:r>
-                            <w:proofErr w:type="gramStart"/>
-                            <w:r>
-                              <w:rPr>
-                                <w:sz w:val="14"/>
-                                <w:szCs w:val="14"/>
-                                <w:lang w:val="en-SG"/>
-                              </w:rPr>
-                              <w:t>CHAR(</w:t>
-                            </w:r>
-                            <w:proofErr w:type="gramEnd"/>
-                            <w:r>
-                              <w:rPr>
-                                <w:sz w:val="14"/>
-                                <w:szCs w:val="14"/>
-                                <w:lang w:val="en-SG"/>
-                              </w:rPr>
-                              <w:t>10) NOT NULL,</w:t>
+                              <w:t>    TierID CHAR(10) NOT NULL,</w:t>
                             </w:r>
                           </w:p>
                           <w:p>
@@ -4972,63 +4529,7 @@
                                 <w:szCs w:val="14"/>
                                 <w:lang w:val="en-SG"/>
                               </w:rPr>
-                              <w:t>    FOREIGN KEY (</w:t>
-                            </w:r>
-                            <w:proofErr w:type="spellStart"/>
-                            <w:r>
-                              <w:rPr>
-                                <w:sz w:val="14"/>
-                                <w:szCs w:val="14"/>
-                                <w:lang w:val="en-SG"/>
-                              </w:rPr>
-                              <w:t>TierID</w:t>
-                            </w:r>
-                            <w:proofErr w:type="spellEnd"/>
-                            <w:r>
-                              <w:rPr>
-                                <w:sz w:val="14"/>
-                                <w:szCs w:val="14"/>
-                                <w:lang w:val="en-SG"/>
-                              </w:rPr>
-                              <w:t xml:space="preserve">) REFERENCES </w:t>
-                            </w:r>
-                            <w:proofErr w:type="spellStart"/>
-                            <w:proofErr w:type="gramStart"/>
-                            <w:r>
-                              <w:rPr>
-                                <w:sz w:val="14"/>
-                                <w:szCs w:val="14"/>
-                                <w:lang w:val="en-SG"/>
-                              </w:rPr>
-                              <w:t>MembershipTier</w:t>
-                            </w:r>
-                            <w:proofErr w:type="spellEnd"/>
-                            <w:r>
-                              <w:rPr>
-                                <w:sz w:val="14"/>
-                                <w:szCs w:val="14"/>
-                                <w:lang w:val="en-SG"/>
-                              </w:rPr>
-                              <w:t>(</w:t>
-                            </w:r>
-                            <w:proofErr w:type="spellStart"/>
-                            <w:proofErr w:type="gramEnd"/>
-                            <w:r>
-                              <w:rPr>
-                                <w:sz w:val="14"/>
-                                <w:szCs w:val="14"/>
-                                <w:lang w:val="en-SG"/>
-                              </w:rPr>
-                              <w:t>TierID</w:t>
-                            </w:r>
-                            <w:proofErr w:type="spellEnd"/>
-                            <w:r>
-                              <w:rPr>
-                                <w:sz w:val="14"/>
-                                <w:szCs w:val="14"/>
-                                <w:lang w:val="en-SG"/>
-                              </w:rPr>
-                              <w:t>)</w:t>
+                              <w:t>    FOREIGN KEY (TierID) REFERENCES MembershipTier(TierID)</w:t>
                             </w:r>
                           </w:p>
                           <w:p>
@@ -5088,43 +4589,7 @@
                                 <w:szCs w:val="14"/>
                                 <w:lang w:val="en-SG"/>
                               </w:rPr>
-                              <w:t xml:space="preserve">    </w:t>
-                            </w:r>
-                            <w:proofErr w:type="spellStart"/>
-                            <w:r>
-                              <w:rPr>
-                                <w:sz w:val="14"/>
-                                <w:szCs w:val="14"/>
-                                <w:lang w:val="en-SG"/>
-                              </w:rPr>
-                              <w:t>StaffID</w:t>
-                            </w:r>
-                            <w:proofErr w:type="spellEnd"/>
-                            <w:r>
-                              <w:rPr>
-                                <w:sz w:val="14"/>
-                                <w:szCs w:val="14"/>
-                                <w:lang w:val="en-SG"/>
-                              </w:rPr>
-                              <w:t xml:space="preserve"> </w:t>
-                            </w:r>
-                            <w:proofErr w:type="gramStart"/>
-                            <w:r>
-                              <w:rPr>
-                                <w:sz w:val="14"/>
-                                <w:szCs w:val="14"/>
-                                <w:lang w:val="en-SG"/>
-                              </w:rPr>
-                              <w:t>CHAR(</w:t>
-                            </w:r>
-                            <w:proofErr w:type="gramEnd"/>
-                            <w:r>
-                              <w:rPr>
-                                <w:sz w:val="14"/>
-                                <w:szCs w:val="14"/>
-                                <w:lang w:val="en-SG"/>
-                              </w:rPr>
-                              <w:t>10) PRIMARY KEY,</w:t>
+                              <w:t>    StaffID CHAR(10) PRIMARY KEY,</w:t>
                             </w:r>
                           </w:p>
                           <w:p>
@@ -5141,25 +4606,7 @@
                                 <w:szCs w:val="14"/>
                                 <w:lang w:val="en-SG"/>
                               </w:rPr>
-                              <w:t xml:space="preserve">    Name </w:t>
-                            </w:r>
-                            <w:proofErr w:type="gramStart"/>
-                            <w:r>
-                              <w:rPr>
-                                <w:sz w:val="14"/>
-                                <w:szCs w:val="14"/>
-                                <w:lang w:val="en-SG"/>
-                              </w:rPr>
-                              <w:t>VARCHAR(</w:t>
-                            </w:r>
-                            <w:proofErr w:type="gramEnd"/>
-                            <w:r>
-                              <w:rPr>
-                                <w:sz w:val="14"/>
-                                <w:szCs w:val="14"/>
-                                <w:lang w:val="en-SG"/>
-                              </w:rPr>
-                              <w:t>100) NOT NULL,</w:t>
+                              <w:t>    Name VARCHAR(100) NOT NULL,</w:t>
                             </w:r>
                           </w:p>
                           <w:p>
@@ -5176,25 +4623,7 @@
                                 <w:szCs w:val="14"/>
                                 <w:lang w:val="en-SG"/>
                               </w:rPr>
-                              <w:t xml:space="preserve">    Contact </w:t>
-                            </w:r>
-                            <w:proofErr w:type="gramStart"/>
-                            <w:r>
-                              <w:rPr>
-                                <w:sz w:val="14"/>
-                                <w:szCs w:val="14"/>
-                                <w:lang w:val="en-SG"/>
-                              </w:rPr>
-                              <w:t>VARCHAR(</w:t>
-                            </w:r>
-                            <w:proofErr w:type="gramEnd"/>
-                            <w:r>
-                              <w:rPr>
-                                <w:sz w:val="14"/>
-                                <w:szCs w:val="14"/>
-                                <w:lang w:val="en-SG"/>
-                              </w:rPr>
-                              <w:t>100) NOT NULL,</w:t>
+                              <w:t>    Contact VARCHAR(100) NOT NULL,</w:t>
                             </w:r>
                           </w:p>
                           <w:p>
@@ -5211,25 +4640,7 @@
                                 <w:szCs w:val="14"/>
                                 <w:lang w:val="en-SG"/>
                               </w:rPr>
-                              <w:t xml:space="preserve">    Gender </w:t>
-                            </w:r>
-                            <w:proofErr w:type="gramStart"/>
-                            <w:r>
-                              <w:rPr>
-                                <w:sz w:val="14"/>
-                                <w:szCs w:val="14"/>
-                                <w:lang w:val="en-SG"/>
-                              </w:rPr>
-                              <w:t>CHAR(</w:t>
-                            </w:r>
-                            <w:proofErr w:type="gramEnd"/>
-                            <w:r>
-                              <w:rPr>
-                                <w:sz w:val="14"/>
-                                <w:szCs w:val="14"/>
-                                <w:lang w:val="en-SG"/>
-                              </w:rPr>
-                              <w:t>1) NOT NULL,</w:t>
+                              <w:t>    Gender CHAR(1) NOT NULL,</w:t>
                             </w:r>
                           </w:p>
                           <w:p>
@@ -5246,43 +4657,7 @@
                                 <w:szCs w:val="14"/>
                                 <w:lang w:val="en-SG"/>
                               </w:rPr>
-                              <w:t xml:space="preserve">    </w:t>
-                            </w:r>
-                            <w:proofErr w:type="spellStart"/>
-                            <w:r>
-                              <w:rPr>
-                                <w:sz w:val="14"/>
-                                <w:szCs w:val="14"/>
-                                <w:lang w:val="en-SG"/>
-                              </w:rPr>
-                              <w:t>EmploymentType</w:t>
-                            </w:r>
-                            <w:proofErr w:type="spellEnd"/>
-                            <w:r>
-                              <w:rPr>
-                                <w:sz w:val="14"/>
-                                <w:szCs w:val="14"/>
-                                <w:lang w:val="en-SG"/>
-                              </w:rPr>
-                              <w:t xml:space="preserve"> </w:t>
-                            </w:r>
-                            <w:proofErr w:type="gramStart"/>
-                            <w:r>
-                              <w:rPr>
-                                <w:sz w:val="14"/>
-                                <w:szCs w:val="14"/>
-                                <w:lang w:val="en-SG"/>
-                              </w:rPr>
-                              <w:t>VARCHAR(</w:t>
-                            </w:r>
-                            <w:proofErr w:type="gramEnd"/>
-                            <w:r>
-                              <w:rPr>
-                                <w:sz w:val="14"/>
-                                <w:szCs w:val="14"/>
-                                <w:lang w:val="en-SG"/>
-                              </w:rPr>
-                              <w:t>20) NOT NULL,</w:t>
+                              <w:t>    EmploymentType VARCHAR(20) NOT NULL,</w:t>
                             </w:r>
                           </w:p>
                           <w:p>
@@ -5316,25 +4691,7 @@
                                 <w:szCs w:val="14"/>
                                 <w:lang w:val="en-SG"/>
                               </w:rPr>
-                              <w:t xml:space="preserve">    Department </w:t>
-                            </w:r>
-                            <w:proofErr w:type="gramStart"/>
-                            <w:r>
-                              <w:rPr>
-                                <w:sz w:val="14"/>
-                                <w:szCs w:val="14"/>
-                                <w:lang w:val="en-SG"/>
-                              </w:rPr>
-                              <w:t>VARCHAR(</w:t>
-                            </w:r>
-                            <w:proofErr w:type="gramEnd"/>
-                            <w:r>
-                              <w:rPr>
-                                <w:sz w:val="14"/>
-                                <w:szCs w:val="14"/>
-                                <w:lang w:val="en-SG"/>
-                              </w:rPr>
-                              <w:t>50) NOT NULL,</w:t>
+                              <w:t>    Department VARCHAR(50) NOT NULL,</w:t>
                             </w:r>
                           </w:p>
                           <w:p>
@@ -5411,43 +4768,7 @@
                                 <w:szCs w:val="14"/>
                                 <w:lang w:val="en-SG"/>
                               </w:rPr>
-                              <w:t xml:space="preserve">    </w:t>
-                            </w:r>
-                            <w:proofErr w:type="spellStart"/>
-                            <w:r>
-                              <w:rPr>
-                                <w:sz w:val="14"/>
-                                <w:szCs w:val="14"/>
-                                <w:lang w:val="en-SG"/>
-                              </w:rPr>
-                              <w:t>BookID</w:t>
-                            </w:r>
-                            <w:proofErr w:type="spellEnd"/>
-                            <w:r>
-                              <w:rPr>
-                                <w:sz w:val="14"/>
-                                <w:szCs w:val="14"/>
-                                <w:lang w:val="en-SG"/>
-                              </w:rPr>
-                              <w:t xml:space="preserve"> </w:t>
-                            </w:r>
-                            <w:proofErr w:type="gramStart"/>
-                            <w:r>
-                              <w:rPr>
-                                <w:sz w:val="14"/>
-                                <w:szCs w:val="14"/>
-                                <w:lang w:val="en-SG"/>
-                              </w:rPr>
-                              <w:t>CHAR(</w:t>
-                            </w:r>
-                            <w:proofErr w:type="gramEnd"/>
-                            <w:r>
-                              <w:rPr>
-                                <w:sz w:val="14"/>
-                                <w:szCs w:val="14"/>
-                                <w:lang w:val="en-SG"/>
-                              </w:rPr>
-                              <w:t>10) PRIMARY KEY,</w:t>
+                              <w:t>    BookID CHAR(10) PRIMARY KEY,</w:t>
                             </w:r>
                           </w:p>
                           <w:p>
@@ -5464,25 +4785,7 @@
                                 <w:szCs w:val="14"/>
                                 <w:lang w:val="en-SG"/>
                               </w:rPr>
-                              <w:t xml:space="preserve">    Title </w:t>
-                            </w:r>
-                            <w:proofErr w:type="gramStart"/>
-                            <w:r>
-                              <w:rPr>
-                                <w:sz w:val="14"/>
-                                <w:szCs w:val="14"/>
-                                <w:lang w:val="en-SG"/>
-                              </w:rPr>
-                              <w:t>VARCHAR(</w:t>
-                            </w:r>
-                            <w:proofErr w:type="gramEnd"/>
-                            <w:r>
-                              <w:rPr>
-                                <w:sz w:val="14"/>
-                                <w:szCs w:val="14"/>
-                                <w:lang w:val="en-SG"/>
-                              </w:rPr>
-                              <w:t>200) NOT NULL,</w:t>
+                              <w:t>    Title VARCHAR(200) NOT NULL,</w:t>
                             </w:r>
                           </w:p>
                           <w:p>
@@ -5499,25 +4802,7 @@
                                 <w:szCs w:val="14"/>
                                 <w:lang w:val="en-SG"/>
                               </w:rPr>
-                              <w:t xml:space="preserve">    Author </w:t>
-                            </w:r>
-                            <w:proofErr w:type="gramStart"/>
-                            <w:r>
-                              <w:rPr>
-                                <w:sz w:val="14"/>
-                                <w:szCs w:val="14"/>
-                                <w:lang w:val="en-SG"/>
-                              </w:rPr>
-                              <w:t>VARCHAR(</w:t>
-                            </w:r>
-                            <w:proofErr w:type="gramEnd"/>
-                            <w:r>
-                              <w:rPr>
-                                <w:sz w:val="14"/>
-                                <w:szCs w:val="14"/>
-                                <w:lang w:val="en-SG"/>
-                              </w:rPr>
-                              <w:t>100) NOT NULL,</w:t>
+                              <w:t>    Author VARCHAR(100) NOT NULL,</w:t>
                             </w:r>
                           </w:p>
                           <w:p>
@@ -5534,25 +4819,7 @@
                                 <w:szCs w:val="14"/>
                                 <w:lang w:val="en-SG"/>
                               </w:rPr>
-                              <w:t xml:space="preserve">    Genre </w:t>
-                            </w:r>
-                            <w:proofErr w:type="gramStart"/>
-                            <w:r>
-                              <w:rPr>
-                                <w:sz w:val="14"/>
-                                <w:szCs w:val="14"/>
-                                <w:lang w:val="en-SG"/>
-                              </w:rPr>
-                              <w:t>VARCHAR(</w:t>
-                            </w:r>
-                            <w:proofErr w:type="gramEnd"/>
-                            <w:r>
-                              <w:rPr>
-                                <w:sz w:val="14"/>
-                                <w:szCs w:val="14"/>
-                                <w:lang w:val="en-SG"/>
-                              </w:rPr>
-                              <w:t>50) NOT NULL,</w:t>
+                              <w:t>    Genre VARCHAR(50) NOT NULL,</w:t>
                             </w:r>
                           </w:p>
                           <w:p>
@@ -5569,43 +4836,7 @@
                                 <w:szCs w:val="14"/>
                                 <w:lang w:val="en-SG"/>
                               </w:rPr>
-                              <w:t xml:space="preserve">    </w:t>
-                            </w:r>
-                            <w:proofErr w:type="spellStart"/>
-                            <w:r>
-                              <w:rPr>
-                                <w:sz w:val="14"/>
-                                <w:szCs w:val="14"/>
-                                <w:lang w:val="en-SG"/>
-                              </w:rPr>
-                              <w:t>MinTierID</w:t>
-                            </w:r>
-                            <w:proofErr w:type="spellEnd"/>
-                            <w:r>
-                              <w:rPr>
-                                <w:sz w:val="14"/>
-                                <w:szCs w:val="14"/>
-                                <w:lang w:val="en-SG"/>
-                              </w:rPr>
-                              <w:t xml:space="preserve"> </w:t>
-                            </w:r>
-                            <w:proofErr w:type="gramStart"/>
-                            <w:r>
-                              <w:rPr>
-                                <w:sz w:val="14"/>
-                                <w:szCs w:val="14"/>
-                                <w:lang w:val="en-SG"/>
-                              </w:rPr>
-                              <w:t>CHAR(</w:t>
-                            </w:r>
-                            <w:proofErr w:type="gramEnd"/>
-                            <w:r>
-                              <w:rPr>
-                                <w:sz w:val="14"/>
-                                <w:szCs w:val="14"/>
-                                <w:lang w:val="en-SG"/>
-                              </w:rPr>
-                              <w:t>5) NOT NULL,</w:t>
+                              <w:t>    MinTierID CHAR(5) NOT NULL,</w:t>
                             </w:r>
                           </w:p>
                           <w:p>
@@ -5622,63 +4853,7 @@
                                 <w:szCs w:val="14"/>
                                 <w:lang w:val="en-SG"/>
                               </w:rPr>
-                              <w:t>    FOREIGN KEY (</w:t>
-                            </w:r>
-                            <w:proofErr w:type="spellStart"/>
-                            <w:r>
-                              <w:rPr>
-                                <w:sz w:val="14"/>
-                                <w:szCs w:val="14"/>
-                                <w:lang w:val="en-SG"/>
-                              </w:rPr>
-                              <w:t>MinTierID</w:t>
-                            </w:r>
-                            <w:proofErr w:type="spellEnd"/>
-                            <w:r>
-                              <w:rPr>
-                                <w:sz w:val="14"/>
-                                <w:szCs w:val="14"/>
-                                <w:lang w:val="en-SG"/>
-                              </w:rPr>
-                              <w:t xml:space="preserve">) REFERENCES </w:t>
-                            </w:r>
-                            <w:proofErr w:type="spellStart"/>
-                            <w:proofErr w:type="gramStart"/>
-                            <w:r>
-                              <w:rPr>
-                                <w:sz w:val="14"/>
-                                <w:szCs w:val="14"/>
-                                <w:lang w:val="en-SG"/>
-                              </w:rPr>
-                              <w:t>MembershipTier</w:t>
-                            </w:r>
-                            <w:proofErr w:type="spellEnd"/>
-                            <w:r>
-                              <w:rPr>
-                                <w:sz w:val="14"/>
-                                <w:szCs w:val="14"/>
-                                <w:lang w:val="en-SG"/>
-                              </w:rPr>
-                              <w:t>(</w:t>
-                            </w:r>
-                            <w:proofErr w:type="spellStart"/>
-                            <w:proofErr w:type="gramEnd"/>
-                            <w:r>
-                              <w:rPr>
-                                <w:sz w:val="14"/>
-                                <w:szCs w:val="14"/>
-                                <w:lang w:val="en-SG"/>
-                              </w:rPr>
-                              <w:t>TierID</w:t>
-                            </w:r>
-                            <w:proofErr w:type="spellEnd"/>
-                            <w:r>
-                              <w:rPr>
-                                <w:sz w:val="14"/>
-                                <w:szCs w:val="14"/>
-                                <w:lang w:val="en-SG"/>
-                              </w:rPr>
-                              <w:t>)</w:t>
+                              <w:t>    FOREIGN KEY (MinTierID) REFERENCES MembershipTier(TierID)</w:t>
                             </w:r>
                           </w:p>
                           <w:p>
@@ -5721,25 +4896,7 @@
                                 <w:szCs w:val="14"/>
                                 <w:lang w:val="en-SG"/>
                               </w:rPr>
-                              <w:t xml:space="preserve">CREATE TABLE </w:t>
-                            </w:r>
-                            <w:proofErr w:type="spellStart"/>
-                            <w:r>
-                              <w:rPr>
-                                <w:sz w:val="14"/>
-                                <w:szCs w:val="14"/>
-                                <w:lang w:val="en-SG"/>
-                              </w:rPr>
-                              <w:t>BookCopy</w:t>
-                            </w:r>
-                            <w:proofErr w:type="spellEnd"/>
-                            <w:r>
-                              <w:rPr>
-                                <w:sz w:val="14"/>
-                                <w:szCs w:val="14"/>
-                                <w:lang w:val="en-SG"/>
-                              </w:rPr>
-                              <w:t xml:space="preserve"> (</w:t>
+                              <w:t>CREATE TABLE BookCopy (</w:t>
                             </w:r>
                           </w:p>
                           <w:p>
@@ -5756,43 +4913,7 @@
                                 <w:szCs w:val="14"/>
                                 <w:lang w:val="en-SG"/>
                               </w:rPr>
-                              <w:t xml:space="preserve">    </w:t>
-                            </w:r>
-                            <w:proofErr w:type="spellStart"/>
-                            <w:r>
-                              <w:rPr>
-                                <w:sz w:val="14"/>
-                                <w:szCs w:val="14"/>
-                                <w:lang w:val="en-SG"/>
-                              </w:rPr>
-                              <w:t>BookID</w:t>
-                            </w:r>
-                            <w:proofErr w:type="spellEnd"/>
-                            <w:r>
-                              <w:rPr>
-                                <w:sz w:val="14"/>
-                                <w:szCs w:val="14"/>
-                                <w:lang w:val="en-SG"/>
-                              </w:rPr>
-                              <w:t xml:space="preserve"> </w:t>
-                            </w:r>
-                            <w:proofErr w:type="gramStart"/>
-                            <w:r>
-                              <w:rPr>
-                                <w:sz w:val="14"/>
-                                <w:szCs w:val="14"/>
-                                <w:lang w:val="en-SG"/>
-                              </w:rPr>
-                              <w:t>CHAR(</w:t>
-                            </w:r>
-                            <w:proofErr w:type="gramEnd"/>
-                            <w:r>
-                              <w:rPr>
-                                <w:sz w:val="14"/>
-                                <w:szCs w:val="14"/>
-                                <w:lang w:val="en-SG"/>
-                              </w:rPr>
-                              <w:t>10) NOT NULL,</w:t>
+                              <w:t>    BookID CHAR(10) NOT NULL,</w:t>
                             </w:r>
                           </w:p>
                           <w:p>
@@ -5809,25 +4930,7 @@
                                 <w:szCs w:val="14"/>
                                 <w:lang w:val="en-SG"/>
                               </w:rPr>
-                              <w:t xml:space="preserve">    </w:t>
-                            </w:r>
-                            <w:proofErr w:type="spellStart"/>
-                            <w:r>
-                              <w:rPr>
-                                <w:sz w:val="14"/>
-                                <w:szCs w:val="14"/>
-                                <w:lang w:val="en-SG"/>
-                              </w:rPr>
-                              <w:t>CopySeqNo</w:t>
-                            </w:r>
-                            <w:proofErr w:type="spellEnd"/>
-                            <w:r>
-                              <w:rPr>
-                                <w:sz w:val="14"/>
-                                <w:szCs w:val="14"/>
-                                <w:lang w:val="en-SG"/>
-                              </w:rPr>
-                              <w:t xml:space="preserve"> INT NOT NULL,</w:t>
+                              <w:t>    CopySeqNo INT NOT NULL,</w:t>
                             </w:r>
                           </w:p>
                           <w:p>
@@ -5844,25 +4947,7 @@
                                 <w:szCs w:val="14"/>
                                 <w:lang w:val="en-SG"/>
                               </w:rPr>
-                              <w:t xml:space="preserve">    Status </w:t>
-                            </w:r>
-                            <w:proofErr w:type="gramStart"/>
-                            <w:r>
-                              <w:rPr>
-                                <w:sz w:val="14"/>
-                                <w:szCs w:val="14"/>
-                                <w:lang w:val="en-SG"/>
-                              </w:rPr>
-                              <w:t>VARCHAR(</w:t>
-                            </w:r>
-                            <w:proofErr w:type="gramEnd"/>
-                            <w:r>
-                              <w:rPr>
-                                <w:sz w:val="14"/>
-                                <w:szCs w:val="14"/>
-                                <w:lang w:val="en-SG"/>
-                              </w:rPr>
-                              <w:t>20) NOT NULL,</w:t>
+                              <w:t>    Status VARCHAR(20) NOT NULL,</w:t>
                             </w:r>
                           </w:p>
                           <w:p>
@@ -5879,43 +4964,7 @@
                                 <w:szCs w:val="14"/>
                                 <w:lang w:val="en-SG"/>
                               </w:rPr>
-                              <w:t>    PRIMARY KEY (</w:t>
-                            </w:r>
-                            <w:proofErr w:type="spellStart"/>
-                            <w:r>
-                              <w:rPr>
-                                <w:sz w:val="14"/>
-                                <w:szCs w:val="14"/>
-                                <w:lang w:val="en-SG"/>
-                              </w:rPr>
-                              <w:t>BookID</w:t>
-                            </w:r>
-                            <w:proofErr w:type="spellEnd"/>
-                            <w:r>
-                              <w:rPr>
-                                <w:sz w:val="14"/>
-                                <w:szCs w:val="14"/>
-                                <w:lang w:val="en-SG"/>
-                              </w:rPr>
-                              <w:t xml:space="preserve">, </w:t>
-                            </w:r>
-                            <w:proofErr w:type="spellStart"/>
-                            <w:r>
-                              <w:rPr>
-                                <w:sz w:val="14"/>
-                                <w:szCs w:val="14"/>
-                                <w:lang w:val="en-SG"/>
-                              </w:rPr>
-                              <w:t>CopySeqNo</w:t>
-                            </w:r>
-                            <w:proofErr w:type="spellEnd"/>
-                            <w:r>
-                              <w:rPr>
-                                <w:sz w:val="14"/>
-                                <w:szCs w:val="14"/>
-                                <w:lang w:val="en-SG"/>
-                              </w:rPr>
-                              <w:t>),</w:t>
+                              <w:t>    PRIMARY KEY (BookID, CopySeqNo),</w:t>
                             </w:r>
                           </w:p>
                           <w:p>
@@ -5932,53 +4981,7 @@
                                 <w:szCs w:val="14"/>
                                 <w:lang w:val="en-SG"/>
                               </w:rPr>
-                              <w:t>    FOREIGN KEY (</w:t>
-                            </w:r>
-                            <w:proofErr w:type="spellStart"/>
-                            <w:r>
-                              <w:rPr>
-                                <w:sz w:val="14"/>
-                                <w:szCs w:val="14"/>
-                                <w:lang w:val="en-SG"/>
-                              </w:rPr>
-                              <w:t>BookID</w:t>
-                            </w:r>
-                            <w:proofErr w:type="spellEnd"/>
-                            <w:r>
-                              <w:rPr>
-                                <w:sz w:val="14"/>
-                                <w:szCs w:val="14"/>
-                                <w:lang w:val="en-SG"/>
-                              </w:rPr>
-                              <w:t xml:space="preserve">) REFERENCES </w:t>
-                            </w:r>
-                            <w:proofErr w:type="gramStart"/>
-                            <w:r>
-                              <w:rPr>
-                                <w:sz w:val="14"/>
-                                <w:szCs w:val="14"/>
-                                <w:lang w:val="en-SG"/>
-                              </w:rPr>
-                              <w:t>Book(</w:t>
-                            </w:r>
-                            <w:proofErr w:type="spellStart"/>
-                            <w:proofErr w:type="gramEnd"/>
-                            <w:r>
-                              <w:rPr>
-                                <w:sz w:val="14"/>
-                                <w:szCs w:val="14"/>
-                                <w:lang w:val="en-SG"/>
-                              </w:rPr>
-                              <w:t>BookID</w:t>
-                            </w:r>
-                            <w:proofErr w:type="spellEnd"/>
-                            <w:r>
-                              <w:rPr>
-                                <w:sz w:val="14"/>
-                                <w:szCs w:val="14"/>
-                                <w:lang w:val="en-SG"/>
-                              </w:rPr>
-                              <w:t>)</w:t>
+                              <w:t>    FOREIGN KEY (BookID) REFERENCES Book(BookID)</w:t>
                             </w:r>
                           </w:p>
                           <w:p>
@@ -6038,43 +5041,7 @@
                                 <w:szCs w:val="14"/>
                                 <w:lang w:val="en-SG"/>
                               </w:rPr>
-                              <w:t xml:space="preserve">    </w:t>
-                            </w:r>
-                            <w:proofErr w:type="spellStart"/>
-                            <w:r>
-                              <w:rPr>
-                                <w:sz w:val="14"/>
-                                <w:szCs w:val="14"/>
-                                <w:lang w:val="en-SG"/>
-                              </w:rPr>
-                              <w:t>MemberID</w:t>
-                            </w:r>
-                            <w:proofErr w:type="spellEnd"/>
-                            <w:r>
-                              <w:rPr>
-                                <w:sz w:val="14"/>
-                                <w:szCs w:val="14"/>
-                                <w:lang w:val="en-SG"/>
-                              </w:rPr>
-                              <w:t xml:space="preserve"> </w:t>
-                            </w:r>
-                            <w:proofErr w:type="gramStart"/>
-                            <w:r>
-                              <w:rPr>
-                                <w:sz w:val="14"/>
-                                <w:szCs w:val="14"/>
-                                <w:lang w:val="en-SG"/>
-                              </w:rPr>
-                              <w:t>CHAR(</w:t>
-                            </w:r>
-                            <w:proofErr w:type="gramEnd"/>
-                            <w:r>
-                              <w:rPr>
-                                <w:sz w:val="14"/>
-                                <w:szCs w:val="14"/>
-                                <w:lang w:val="en-SG"/>
-                              </w:rPr>
-                              <w:t>10) NOT NULL,</w:t>
+                              <w:t>    MemberID CHAR(10) NOT NULL,</w:t>
                             </w:r>
                           </w:p>
                           <w:p>
@@ -6091,43 +5058,7 @@
                                 <w:szCs w:val="14"/>
                                 <w:lang w:val="en-SG"/>
                               </w:rPr>
-                              <w:t xml:space="preserve">    </w:t>
-                            </w:r>
-                            <w:proofErr w:type="spellStart"/>
-                            <w:r>
-                              <w:rPr>
-                                <w:sz w:val="14"/>
-                                <w:szCs w:val="14"/>
-                                <w:lang w:val="en-SG"/>
-                              </w:rPr>
-                              <w:t>StaffID</w:t>
-                            </w:r>
-                            <w:proofErr w:type="spellEnd"/>
-                            <w:r>
-                              <w:rPr>
-                                <w:sz w:val="14"/>
-                                <w:szCs w:val="14"/>
-                                <w:lang w:val="en-SG"/>
-                              </w:rPr>
-                              <w:t xml:space="preserve"> </w:t>
-                            </w:r>
-                            <w:proofErr w:type="gramStart"/>
-                            <w:r>
-                              <w:rPr>
-                                <w:sz w:val="14"/>
-                                <w:szCs w:val="14"/>
-                                <w:lang w:val="en-SG"/>
-                              </w:rPr>
-                              <w:t>CHAR(</w:t>
-                            </w:r>
-                            <w:proofErr w:type="gramEnd"/>
-                            <w:r>
-                              <w:rPr>
-                                <w:sz w:val="14"/>
-                                <w:szCs w:val="14"/>
-                                <w:lang w:val="en-SG"/>
-                              </w:rPr>
-                              <w:t>10) NOT NULL,</w:t>
+                              <w:t>    StaffID CHAR(10) NOT NULL,</w:t>
                             </w:r>
                           </w:p>
                           <w:p>
@@ -6144,43 +5075,7 @@
                                 <w:szCs w:val="14"/>
                                 <w:lang w:val="en-SG"/>
                               </w:rPr>
-                              <w:t xml:space="preserve">    </w:t>
-                            </w:r>
-                            <w:proofErr w:type="spellStart"/>
-                            <w:r>
-                              <w:rPr>
-                                <w:sz w:val="14"/>
-                                <w:szCs w:val="14"/>
-                                <w:lang w:val="en-SG"/>
-                              </w:rPr>
-                              <w:t>BookID</w:t>
-                            </w:r>
-                            <w:proofErr w:type="spellEnd"/>
-                            <w:r>
-                              <w:rPr>
-                                <w:sz w:val="14"/>
-                                <w:szCs w:val="14"/>
-                                <w:lang w:val="en-SG"/>
-                              </w:rPr>
-                              <w:t xml:space="preserve"> </w:t>
-                            </w:r>
-                            <w:proofErr w:type="gramStart"/>
-                            <w:r>
-                              <w:rPr>
-                                <w:sz w:val="14"/>
-                                <w:szCs w:val="14"/>
-                                <w:lang w:val="en-SG"/>
-                              </w:rPr>
-                              <w:t>CHAR(</w:t>
-                            </w:r>
-                            <w:proofErr w:type="gramEnd"/>
-                            <w:r>
-                              <w:rPr>
-                                <w:sz w:val="14"/>
-                                <w:szCs w:val="14"/>
-                                <w:lang w:val="en-SG"/>
-                              </w:rPr>
-                              <w:t>10) NOT NULL,</w:t>
+                              <w:t>    BookID CHAR(10) NOT NULL,</w:t>
                             </w:r>
                           </w:p>
                           <w:p>
@@ -6197,25 +5092,7 @@
                                 <w:szCs w:val="14"/>
                                 <w:lang w:val="en-SG"/>
                               </w:rPr>
-                              <w:t xml:space="preserve">    </w:t>
-                            </w:r>
-                            <w:proofErr w:type="spellStart"/>
-                            <w:r>
-                              <w:rPr>
-                                <w:sz w:val="14"/>
-                                <w:szCs w:val="14"/>
-                                <w:lang w:val="en-SG"/>
-                              </w:rPr>
-                              <w:t>CopySeqNo</w:t>
-                            </w:r>
-                            <w:proofErr w:type="spellEnd"/>
-                            <w:r>
-                              <w:rPr>
-                                <w:sz w:val="14"/>
-                                <w:szCs w:val="14"/>
-                                <w:lang w:val="en-SG"/>
-                              </w:rPr>
-                              <w:t xml:space="preserve"> INT NOT NULL,</w:t>
+                              <w:t>    CopySeqNo INT NOT NULL,</w:t>
                             </w:r>
                           </w:p>
                           <w:p>
@@ -6249,25 +5126,7 @@
                                 <w:szCs w:val="14"/>
                                 <w:lang w:val="en-SG"/>
                               </w:rPr>
-                              <w:t xml:space="preserve">    </w:t>
-                            </w:r>
-                            <w:proofErr w:type="spellStart"/>
-                            <w:r>
-                              <w:rPr>
-                                <w:sz w:val="14"/>
-                                <w:szCs w:val="14"/>
-                                <w:lang w:val="en-SG"/>
-                              </w:rPr>
-                              <w:t>DueDate</w:t>
-                            </w:r>
-                            <w:proofErr w:type="spellEnd"/>
-                            <w:r>
-                              <w:rPr>
-                                <w:sz w:val="14"/>
-                                <w:szCs w:val="14"/>
-                                <w:lang w:val="en-SG"/>
-                              </w:rPr>
-                              <w:t xml:space="preserve"> DATE NOT NULL,</w:t>
+                              <w:t>    DueDate DATE NOT NULL,</w:t>
                             </w:r>
                           </w:p>
                           <w:p>
@@ -6284,25 +5143,7 @@
                                 <w:szCs w:val="14"/>
                                 <w:lang w:val="en-SG"/>
                               </w:rPr>
-                              <w:t xml:space="preserve">    </w:t>
-                            </w:r>
-                            <w:proofErr w:type="spellStart"/>
-                            <w:r>
-                              <w:rPr>
-                                <w:sz w:val="14"/>
-                                <w:szCs w:val="14"/>
-                                <w:lang w:val="en-SG"/>
-                              </w:rPr>
-                              <w:t>ReturnDatetime</w:t>
-                            </w:r>
-                            <w:proofErr w:type="spellEnd"/>
-                            <w:r>
-                              <w:rPr>
-                                <w:sz w:val="14"/>
-                                <w:szCs w:val="14"/>
-                                <w:lang w:val="en-SG"/>
-                              </w:rPr>
-                              <w:t xml:space="preserve"> DATETIME NULL,</w:t>
+                              <w:t>    ReturnDatetime DATETIME NULL,</w:t>
                             </w:r>
                           </w:p>
                           <w:p>
@@ -6319,61 +5160,7 @@
                                 <w:szCs w:val="14"/>
                                 <w:lang w:val="en-SG"/>
                               </w:rPr>
-                              <w:t>    PRIMARY KEY (</w:t>
-                            </w:r>
-                            <w:proofErr w:type="spellStart"/>
-                            <w:r>
-                              <w:rPr>
-                                <w:sz w:val="14"/>
-                                <w:szCs w:val="14"/>
-                                <w:lang w:val="en-SG"/>
-                              </w:rPr>
-                              <w:t>MemberID</w:t>
-                            </w:r>
-                            <w:proofErr w:type="spellEnd"/>
-                            <w:r>
-                              <w:rPr>
-                                <w:sz w:val="14"/>
-                                <w:szCs w:val="14"/>
-                                <w:lang w:val="en-SG"/>
-                              </w:rPr>
-                              <w:t xml:space="preserve">, </w:t>
-                            </w:r>
-                            <w:proofErr w:type="spellStart"/>
-                            <w:r>
-                              <w:rPr>
-                                <w:sz w:val="14"/>
-                                <w:szCs w:val="14"/>
-                                <w:lang w:val="en-SG"/>
-                              </w:rPr>
-                              <w:t>BookID</w:t>
-                            </w:r>
-                            <w:proofErr w:type="spellEnd"/>
-                            <w:r>
-                              <w:rPr>
-                                <w:sz w:val="14"/>
-                                <w:szCs w:val="14"/>
-                                <w:lang w:val="en-SG"/>
-                              </w:rPr>
-                              <w:t xml:space="preserve">, </w:t>
-                            </w:r>
-                            <w:proofErr w:type="spellStart"/>
-                            <w:r>
-                              <w:rPr>
-                                <w:sz w:val="14"/>
-                                <w:szCs w:val="14"/>
-                                <w:lang w:val="en-SG"/>
-                              </w:rPr>
-                              <w:t>CopySeqNo</w:t>
-                            </w:r>
-                            <w:proofErr w:type="spellEnd"/>
-                            <w:r>
-                              <w:rPr>
-                                <w:sz w:val="14"/>
-                                <w:szCs w:val="14"/>
-                                <w:lang w:val="en-SG"/>
-                              </w:rPr>
-                              <w:t>, StartDatetime),</w:t>
+                              <w:t>    PRIMARY KEY (MemberID, BookID, CopySeqNo, StartDatetime),</w:t>
                             </w:r>
                           </w:p>
                           <w:p>
@@ -6390,53 +5177,7 @@
                                 <w:szCs w:val="14"/>
                                 <w:lang w:val="en-SG"/>
                               </w:rPr>
-                              <w:t>    FOREIGN KEY (</w:t>
-                            </w:r>
-                            <w:proofErr w:type="spellStart"/>
-                            <w:r>
-                              <w:rPr>
-                                <w:sz w:val="14"/>
-                                <w:szCs w:val="14"/>
-                                <w:lang w:val="en-SG"/>
-                              </w:rPr>
-                              <w:t>MemberID</w:t>
-                            </w:r>
-                            <w:proofErr w:type="spellEnd"/>
-                            <w:r>
-                              <w:rPr>
-                                <w:sz w:val="14"/>
-                                <w:szCs w:val="14"/>
-                                <w:lang w:val="en-SG"/>
-                              </w:rPr>
-                              <w:t xml:space="preserve">) REFERENCES </w:t>
-                            </w:r>
-                            <w:proofErr w:type="gramStart"/>
-                            <w:r>
-                              <w:rPr>
-                                <w:sz w:val="14"/>
-                                <w:szCs w:val="14"/>
-                                <w:lang w:val="en-SG"/>
-                              </w:rPr>
-                              <w:t>Member(</w:t>
-                            </w:r>
-                            <w:proofErr w:type="spellStart"/>
-                            <w:proofErr w:type="gramEnd"/>
-                            <w:r>
-                              <w:rPr>
-                                <w:sz w:val="14"/>
-                                <w:szCs w:val="14"/>
-                                <w:lang w:val="en-SG"/>
-                              </w:rPr>
-                              <w:t>MemberID</w:t>
-                            </w:r>
-                            <w:proofErr w:type="spellEnd"/>
-                            <w:r>
-                              <w:rPr>
-                                <w:sz w:val="14"/>
-                                <w:szCs w:val="14"/>
-                                <w:lang w:val="en-SG"/>
-                              </w:rPr>
-                              <w:t>),</w:t>
+                              <w:t>    FOREIGN KEY (MemberID) REFERENCES Member(MemberID),</w:t>
                             </w:r>
                           </w:p>
                           <w:p>
@@ -6453,53 +5194,7 @@
                                 <w:szCs w:val="14"/>
                                 <w:lang w:val="en-SG"/>
                               </w:rPr>
-                              <w:t>    FOREIGN KEY (</w:t>
-                            </w:r>
-                            <w:proofErr w:type="spellStart"/>
-                            <w:r>
-                              <w:rPr>
-                                <w:sz w:val="14"/>
-                                <w:szCs w:val="14"/>
-                                <w:lang w:val="en-SG"/>
-                              </w:rPr>
-                              <w:t>StaffID</w:t>
-                            </w:r>
-                            <w:proofErr w:type="spellEnd"/>
-                            <w:r>
-                              <w:rPr>
-                                <w:sz w:val="14"/>
-                                <w:szCs w:val="14"/>
-                                <w:lang w:val="en-SG"/>
-                              </w:rPr>
-                              <w:t xml:space="preserve">) REFERENCES </w:t>
-                            </w:r>
-                            <w:proofErr w:type="gramStart"/>
-                            <w:r>
-                              <w:rPr>
-                                <w:sz w:val="14"/>
-                                <w:szCs w:val="14"/>
-                                <w:lang w:val="en-SG"/>
-                              </w:rPr>
-                              <w:t>Staff(</w:t>
-                            </w:r>
-                            <w:proofErr w:type="spellStart"/>
-                            <w:proofErr w:type="gramEnd"/>
-                            <w:r>
-                              <w:rPr>
-                                <w:sz w:val="14"/>
-                                <w:szCs w:val="14"/>
-                                <w:lang w:val="en-SG"/>
-                              </w:rPr>
-                              <w:t>StaffID</w:t>
-                            </w:r>
-                            <w:proofErr w:type="spellEnd"/>
-                            <w:r>
-                              <w:rPr>
-                                <w:sz w:val="14"/>
-                                <w:szCs w:val="14"/>
-                                <w:lang w:val="en-SG"/>
-                              </w:rPr>
-                              <w:t>),</w:t>
+                              <w:t>    FOREIGN KEY (StaffID) REFERENCES Staff(StaffID),</w:t>
                             </w:r>
                           </w:p>
                           <w:p>
@@ -6516,99 +5211,7 @@
                                 <w:szCs w:val="14"/>
                                 <w:lang w:val="en-SG"/>
                               </w:rPr>
-                              <w:t>    FOREIGN KEY (</w:t>
-                            </w:r>
-                            <w:proofErr w:type="spellStart"/>
-                            <w:r>
-                              <w:rPr>
-                                <w:sz w:val="14"/>
-                                <w:szCs w:val="14"/>
-                                <w:lang w:val="en-SG"/>
-                              </w:rPr>
-                              <w:t>BookID</w:t>
-                            </w:r>
-                            <w:proofErr w:type="spellEnd"/>
-                            <w:r>
-                              <w:rPr>
-                                <w:sz w:val="14"/>
-                                <w:szCs w:val="14"/>
-                                <w:lang w:val="en-SG"/>
-                              </w:rPr>
-                              <w:t xml:space="preserve">, </w:t>
-                            </w:r>
-                            <w:proofErr w:type="spellStart"/>
-                            <w:r>
-                              <w:rPr>
-                                <w:sz w:val="14"/>
-                                <w:szCs w:val="14"/>
-                                <w:lang w:val="en-SG"/>
-                              </w:rPr>
-                              <w:t>CopySeqNo</w:t>
-                            </w:r>
-                            <w:proofErr w:type="spellEnd"/>
-                            <w:r>
-                              <w:rPr>
-                                <w:sz w:val="14"/>
-                                <w:szCs w:val="14"/>
-                                <w:lang w:val="en-SG"/>
-                              </w:rPr>
-                              <w:t xml:space="preserve">) REFERENCES </w:t>
-                            </w:r>
-                            <w:proofErr w:type="spellStart"/>
-                            <w:proofErr w:type="gramStart"/>
-                            <w:r>
-                              <w:rPr>
-                                <w:sz w:val="14"/>
-                                <w:szCs w:val="14"/>
-                                <w:lang w:val="en-SG"/>
-                              </w:rPr>
-                              <w:t>BookCopy</w:t>
-                            </w:r>
-                            <w:proofErr w:type="spellEnd"/>
-                            <w:r>
-                              <w:rPr>
-                                <w:sz w:val="14"/>
-                                <w:szCs w:val="14"/>
-                                <w:lang w:val="en-SG"/>
-                              </w:rPr>
-                              <w:t>(</w:t>
-                            </w:r>
-                            <w:proofErr w:type="spellStart"/>
-                            <w:proofErr w:type="gramEnd"/>
-                            <w:r>
-                              <w:rPr>
-                                <w:sz w:val="14"/>
-                                <w:szCs w:val="14"/>
-                                <w:lang w:val="en-SG"/>
-                              </w:rPr>
-                              <w:t>BookID</w:t>
-                            </w:r>
-                            <w:proofErr w:type="spellEnd"/>
-                            <w:r>
-                              <w:rPr>
-                                <w:sz w:val="14"/>
-                                <w:szCs w:val="14"/>
-                                <w:lang w:val="en-SG"/>
-                              </w:rPr>
-                              <w:t xml:space="preserve">, </w:t>
-                            </w:r>
-                            <w:proofErr w:type="spellStart"/>
-                            <w:r>
-                              <w:rPr>
-                                <w:sz w:val="14"/>
-                                <w:szCs w:val="14"/>
-                                <w:lang w:val="en-SG"/>
-                              </w:rPr>
-                              <w:t>CopySeqNo</w:t>
-                            </w:r>
-                            <w:proofErr w:type="spellEnd"/>
-                            <w:r>
-                              <w:rPr>
-                                <w:sz w:val="14"/>
-                                <w:szCs w:val="14"/>
-                                <w:lang w:val="en-SG"/>
-                              </w:rPr>
-                              <w:t>)</w:t>
+                              <w:t>    FOREIGN KEY (BookID, CopySeqNo) REFERENCES BookCopy(BookID, CopySeqNo)</w:t>
                             </w:r>
                           </w:p>
                           <w:p>
@@ -6664,25 +5267,7 @@
                           <w:szCs w:val="14"/>
                           <w:lang w:val="en-SG"/>
                         </w:rPr>
-                        <w:t xml:space="preserve">CREATE TABLE </w:t>
-                      </w:r>
-                      <w:proofErr w:type="spellStart"/>
-                      <w:r>
-                        <w:rPr>
-                          <w:sz w:val="14"/>
-                          <w:szCs w:val="14"/>
-                          <w:lang w:val="en-SG"/>
-                        </w:rPr>
-                        <w:t>MembershipTier</w:t>
-                      </w:r>
-                      <w:proofErr w:type="spellEnd"/>
-                      <w:r>
-                        <w:rPr>
-                          <w:sz w:val="14"/>
-                          <w:szCs w:val="14"/>
-                          <w:lang w:val="en-SG"/>
-                        </w:rPr>
-                        <w:t xml:space="preserve"> (</w:t>
+                        <w:t>CREATE TABLE MembershipTier (</w:t>
                       </w:r>
                     </w:p>
                     <w:p>
@@ -6699,43 +5284,7 @@
                           <w:szCs w:val="14"/>
                           <w:lang w:val="en-SG"/>
                         </w:rPr>
-                        <w:t xml:space="preserve">    </w:t>
-                      </w:r>
-                      <w:proofErr w:type="spellStart"/>
-                      <w:r>
-                        <w:rPr>
-                          <w:sz w:val="14"/>
-                          <w:szCs w:val="14"/>
-                          <w:lang w:val="en-SG"/>
-                        </w:rPr>
-                        <w:t>TierID</w:t>
-                      </w:r>
-                      <w:proofErr w:type="spellEnd"/>
-                      <w:r>
-                        <w:rPr>
-                          <w:sz w:val="14"/>
-                          <w:szCs w:val="14"/>
-                          <w:lang w:val="en-SG"/>
-                        </w:rPr>
-                        <w:t xml:space="preserve"> </w:t>
-                      </w:r>
-                      <w:proofErr w:type="gramStart"/>
-                      <w:r>
-                        <w:rPr>
-                          <w:sz w:val="14"/>
-                          <w:szCs w:val="14"/>
-                          <w:lang w:val="en-SG"/>
-                        </w:rPr>
-                        <w:t>CHAR(</w:t>
-                      </w:r>
-                      <w:proofErr w:type="gramEnd"/>
-                      <w:r>
-                        <w:rPr>
-                          <w:sz w:val="14"/>
-                          <w:szCs w:val="14"/>
-                          <w:lang w:val="en-SG"/>
-                        </w:rPr>
-                        <w:t>10) PRIMARY KEY,</w:t>
+                        <w:t>    TierID CHAR(10) PRIMARY KEY,</w:t>
                       </w:r>
                     </w:p>
                     <w:p>
@@ -6752,43 +5301,7 @@
                           <w:szCs w:val="14"/>
                           <w:lang w:val="en-SG"/>
                         </w:rPr>
-                        <w:t xml:space="preserve">    </w:t>
-                      </w:r>
-                      <w:proofErr w:type="spellStart"/>
-                      <w:r>
-                        <w:rPr>
-                          <w:sz w:val="14"/>
-                          <w:szCs w:val="14"/>
-                          <w:lang w:val="en-SG"/>
-                        </w:rPr>
-                        <w:t>TierName</w:t>
-                      </w:r>
-                      <w:proofErr w:type="spellEnd"/>
-                      <w:r>
-                        <w:rPr>
-                          <w:sz w:val="14"/>
-                          <w:szCs w:val="14"/>
-                          <w:lang w:val="en-SG"/>
-                        </w:rPr>
-                        <w:t xml:space="preserve"> </w:t>
-                      </w:r>
-                      <w:proofErr w:type="gramStart"/>
-                      <w:r>
-                        <w:rPr>
-                          <w:sz w:val="14"/>
-                          <w:szCs w:val="14"/>
-                          <w:lang w:val="en-SG"/>
-                        </w:rPr>
-                        <w:t>VARCHAR(</w:t>
-                      </w:r>
-                      <w:proofErr w:type="gramEnd"/>
-                      <w:r>
-                        <w:rPr>
-                          <w:sz w:val="14"/>
-                          <w:szCs w:val="14"/>
-                          <w:lang w:val="en-SG"/>
-                        </w:rPr>
-                        <w:t>20) NOT NULL,</w:t>
+                        <w:t>    TierName VARCHAR(20) NOT NULL,</w:t>
                       </w:r>
                     </w:p>
                     <w:p>
@@ -6805,25 +5318,7 @@
                           <w:szCs w:val="14"/>
                           <w:lang w:val="en-SG"/>
                         </w:rPr>
-                        <w:t xml:space="preserve">    </w:t>
-                      </w:r>
-                      <w:proofErr w:type="spellStart"/>
-                      <w:r>
-                        <w:rPr>
-                          <w:sz w:val="14"/>
-                          <w:szCs w:val="14"/>
-                          <w:lang w:val="en-SG"/>
-                        </w:rPr>
-                        <w:t>TierLevel</w:t>
-                      </w:r>
-                      <w:proofErr w:type="spellEnd"/>
-                      <w:r>
-                        <w:rPr>
-                          <w:sz w:val="14"/>
-                          <w:szCs w:val="14"/>
-                          <w:lang w:val="en-SG"/>
-                        </w:rPr>
-                        <w:t xml:space="preserve"> INT NOT NULL,</w:t>
+                        <w:t>    TierLevel INT NOT NULL,</w:t>
                       </w:r>
                     </w:p>
                     <w:p>
@@ -6840,25 +5335,7 @@
                           <w:szCs w:val="14"/>
                           <w:lang w:val="en-SG"/>
                         </w:rPr>
-                        <w:t xml:space="preserve">    </w:t>
-                      </w:r>
-                      <w:proofErr w:type="spellStart"/>
-                      <w:r>
-                        <w:rPr>
-                          <w:sz w:val="14"/>
-                          <w:szCs w:val="14"/>
-                          <w:lang w:val="en-SG"/>
-                        </w:rPr>
-                        <w:t>BorrowLimit</w:t>
-                      </w:r>
-                      <w:proofErr w:type="spellEnd"/>
-                      <w:r>
-                        <w:rPr>
-                          <w:sz w:val="14"/>
-                          <w:szCs w:val="14"/>
-                          <w:lang w:val="en-SG"/>
-                        </w:rPr>
-                        <w:t xml:space="preserve"> INT NOT NULL</w:t>
+                        <w:t>    BorrowLimit INT NOT NULL</w:t>
                       </w:r>
                     </w:p>
                     <w:p>
@@ -6918,43 +5395,7 @@
                           <w:szCs w:val="14"/>
                           <w:lang w:val="en-SG"/>
                         </w:rPr>
-                        <w:t xml:space="preserve">    </w:t>
-                      </w:r>
-                      <w:proofErr w:type="spellStart"/>
-                      <w:r>
-                        <w:rPr>
-                          <w:sz w:val="14"/>
-                          <w:szCs w:val="14"/>
-                          <w:lang w:val="en-SG"/>
-                        </w:rPr>
-                        <w:t>MemberID</w:t>
-                      </w:r>
-                      <w:proofErr w:type="spellEnd"/>
-                      <w:r>
-                        <w:rPr>
-                          <w:sz w:val="14"/>
-                          <w:szCs w:val="14"/>
-                          <w:lang w:val="en-SG"/>
-                        </w:rPr>
-                        <w:t xml:space="preserve"> </w:t>
-                      </w:r>
-                      <w:proofErr w:type="gramStart"/>
-                      <w:r>
-                        <w:rPr>
-                          <w:sz w:val="14"/>
-                          <w:szCs w:val="14"/>
-                          <w:lang w:val="en-SG"/>
-                        </w:rPr>
-                        <w:t>CHAR(</w:t>
-                      </w:r>
-                      <w:proofErr w:type="gramEnd"/>
-                      <w:r>
-                        <w:rPr>
-                          <w:sz w:val="14"/>
-                          <w:szCs w:val="14"/>
-                          <w:lang w:val="en-SG"/>
-                        </w:rPr>
-                        <w:t>10) PRIMARY KEY,</w:t>
+                        <w:t>    MemberID CHAR(10) PRIMARY KEY,</w:t>
                       </w:r>
                     </w:p>
                     <w:p>
@@ -6971,25 +5412,7 @@
                           <w:szCs w:val="14"/>
                           <w:lang w:val="en-SG"/>
                         </w:rPr>
-                        <w:t xml:space="preserve">    Name </w:t>
-                      </w:r>
-                      <w:proofErr w:type="gramStart"/>
-                      <w:r>
-                        <w:rPr>
-                          <w:sz w:val="14"/>
-                          <w:szCs w:val="14"/>
-                          <w:lang w:val="en-SG"/>
-                        </w:rPr>
-                        <w:t>VARCHAR(</w:t>
-                      </w:r>
-                      <w:proofErr w:type="gramEnd"/>
-                      <w:r>
-                        <w:rPr>
-                          <w:sz w:val="14"/>
-                          <w:szCs w:val="14"/>
-                          <w:lang w:val="en-SG"/>
-                        </w:rPr>
-                        <w:t>100) NOT NULL,</w:t>
+                        <w:t>    Name VARCHAR(100) NOT NULL,</w:t>
                       </w:r>
                     </w:p>
                     <w:p>
@@ -7006,25 +5429,7 @@
                           <w:szCs w:val="14"/>
                           <w:lang w:val="en-SG"/>
                         </w:rPr>
-                        <w:t xml:space="preserve">    Contact </w:t>
-                      </w:r>
-                      <w:proofErr w:type="gramStart"/>
-                      <w:r>
-                        <w:rPr>
-                          <w:sz w:val="14"/>
-                          <w:szCs w:val="14"/>
-                          <w:lang w:val="en-SG"/>
-                        </w:rPr>
-                        <w:t>VARCHAR(</w:t>
-                      </w:r>
-                      <w:proofErr w:type="gramEnd"/>
-                      <w:r>
-                        <w:rPr>
-                          <w:sz w:val="14"/>
-                          <w:szCs w:val="14"/>
-                          <w:lang w:val="en-SG"/>
-                        </w:rPr>
-                        <w:t>100) NOT NULL,</w:t>
+                        <w:t>    Contact VARCHAR(100) NOT NULL,</w:t>
                       </w:r>
                     </w:p>
                     <w:p>
@@ -7058,25 +5463,7 @@
                           <w:szCs w:val="14"/>
                           <w:lang w:val="en-SG"/>
                         </w:rPr>
-                        <w:t xml:space="preserve">    Gender </w:t>
-                      </w:r>
-                      <w:proofErr w:type="gramStart"/>
-                      <w:r>
-                        <w:rPr>
-                          <w:sz w:val="14"/>
-                          <w:szCs w:val="14"/>
-                          <w:lang w:val="en-SG"/>
-                        </w:rPr>
-                        <w:t>CHAR(</w:t>
-                      </w:r>
-                      <w:proofErr w:type="gramEnd"/>
-                      <w:r>
-                        <w:rPr>
-                          <w:sz w:val="14"/>
-                          <w:szCs w:val="14"/>
-                          <w:lang w:val="en-SG"/>
-                        </w:rPr>
-                        <w:t>1) NOT NULL,</w:t>
+                        <w:t>    Gender CHAR(1) NOT NULL,</w:t>
                       </w:r>
                     </w:p>
                     <w:p>
@@ -7093,25 +5480,7 @@
                           <w:szCs w:val="14"/>
                           <w:lang w:val="en-SG"/>
                         </w:rPr>
-                        <w:t xml:space="preserve">    Occupation </w:t>
-                      </w:r>
-                      <w:proofErr w:type="gramStart"/>
-                      <w:r>
-                        <w:rPr>
-                          <w:sz w:val="14"/>
-                          <w:szCs w:val="14"/>
-                          <w:lang w:val="en-SG"/>
-                        </w:rPr>
-                        <w:t>VARCHAR(</w:t>
-                      </w:r>
-                      <w:proofErr w:type="gramEnd"/>
-                      <w:r>
-                        <w:rPr>
-                          <w:sz w:val="14"/>
-                          <w:szCs w:val="14"/>
-                          <w:lang w:val="en-SG"/>
-                        </w:rPr>
-                        <w:t>50) NULL,</w:t>
+                        <w:t>    Occupation VARCHAR(50) NULL,</w:t>
                       </w:r>
                     </w:p>
                     <w:p>
@@ -7128,25 +5497,7 @@
                           <w:szCs w:val="14"/>
                           <w:lang w:val="en-SG"/>
                         </w:rPr>
-                        <w:t xml:space="preserve">    </w:t>
-                      </w:r>
-                      <w:proofErr w:type="spellStart"/>
-                      <w:r>
-                        <w:rPr>
-                          <w:sz w:val="14"/>
-                          <w:szCs w:val="14"/>
-                          <w:lang w:val="en-SG"/>
-                        </w:rPr>
-                        <w:t>RegistrationDatetime</w:t>
-                      </w:r>
-                      <w:proofErr w:type="spellEnd"/>
-                      <w:r>
-                        <w:rPr>
-                          <w:sz w:val="14"/>
-                          <w:szCs w:val="14"/>
-                          <w:lang w:val="en-SG"/>
-                        </w:rPr>
-                        <w:t xml:space="preserve"> DATETIME NOT NULL,</w:t>
+                        <w:t>    RegistrationDatetime DATETIME NOT NULL,</w:t>
                       </w:r>
                     </w:p>
                     <w:p>
@@ -7163,43 +5514,7 @@
                           <w:szCs w:val="14"/>
                           <w:lang w:val="en-SG"/>
                         </w:rPr>
-                        <w:t xml:space="preserve">    </w:t>
-                      </w:r>
-                      <w:proofErr w:type="spellStart"/>
-                      <w:r>
-                        <w:rPr>
-                          <w:sz w:val="14"/>
-                          <w:szCs w:val="14"/>
-                          <w:lang w:val="en-SG"/>
-                        </w:rPr>
-                        <w:t>TierID</w:t>
-                      </w:r>
-                      <w:proofErr w:type="spellEnd"/>
-                      <w:r>
-                        <w:rPr>
-                          <w:sz w:val="14"/>
-                          <w:szCs w:val="14"/>
-                          <w:lang w:val="en-SG"/>
-                        </w:rPr>
-                        <w:t xml:space="preserve"> </w:t>
-                      </w:r>
-                      <w:proofErr w:type="gramStart"/>
-                      <w:r>
-                        <w:rPr>
-                          <w:sz w:val="14"/>
-                          <w:szCs w:val="14"/>
-                          <w:lang w:val="en-SG"/>
-                        </w:rPr>
-                        <w:t>CHAR(</w:t>
-                      </w:r>
-                      <w:proofErr w:type="gramEnd"/>
-                      <w:r>
-                        <w:rPr>
-                          <w:sz w:val="14"/>
-                          <w:szCs w:val="14"/>
-                          <w:lang w:val="en-SG"/>
-                        </w:rPr>
-                        <w:t>10) NOT NULL,</w:t>
+                        <w:t>    TierID CHAR(10) NOT NULL,</w:t>
                       </w:r>
                     </w:p>
                     <w:p>
@@ -7216,63 +5531,7 @@
                           <w:szCs w:val="14"/>
                           <w:lang w:val="en-SG"/>
                         </w:rPr>
-                        <w:t>    FOREIGN KEY (</w:t>
-                      </w:r>
-                      <w:proofErr w:type="spellStart"/>
-                      <w:r>
-                        <w:rPr>
-                          <w:sz w:val="14"/>
-                          <w:szCs w:val="14"/>
-                          <w:lang w:val="en-SG"/>
-                        </w:rPr>
-                        <w:t>TierID</w:t>
-                      </w:r>
-                      <w:proofErr w:type="spellEnd"/>
-                      <w:r>
-                        <w:rPr>
-                          <w:sz w:val="14"/>
-                          <w:szCs w:val="14"/>
-                          <w:lang w:val="en-SG"/>
-                        </w:rPr>
-                        <w:t xml:space="preserve">) REFERENCES </w:t>
-                      </w:r>
-                      <w:proofErr w:type="spellStart"/>
-                      <w:proofErr w:type="gramStart"/>
-                      <w:r>
-                        <w:rPr>
-                          <w:sz w:val="14"/>
-                          <w:szCs w:val="14"/>
-                          <w:lang w:val="en-SG"/>
-                        </w:rPr>
-                        <w:t>MembershipTier</w:t>
-                      </w:r>
-                      <w:proofErr w:type="spellEnd"/>
-                      <w:r>
-                        <w:rPr>
-                          <w:sz w:val="14"/>
-                          <w:szCs w:val="14"/>
-                          <w:lang w:val="en-SG"/>
-                        </w:rPr>
-                        <w:t>(</w:t>
-                      </w:r>
-                      <w:proofErr w:type="spellStart"/>
-                      <w:proofErr w:type="gramEnd"/>
-                      <w:r>
-                        <w:rPr>
-                          <w:sz w:val="14"/>
-                          <w:szCs w:val="14"/>
-                          <w:lang w:val="en-SG"/>
-                        </w:rPr>
-                        <w:t>TierID</w:t>
-                      </w:r>
-                      <w:proofErr w:type="spellEnd"/>
-                      <w:r>
-                        <w:rPr>
-                          <w:sz w:val="14"/>
-                          <w:szCs w:val="14"/>
-                          <w:lang w:val="en-SG"/>
-                        </w:rPr>
-                        <w:t>)</w:t>
+                        <w:t>    FOREIGN KEY (TierID) REFERENCES MembershipTier(TierID)</w:t>
                       </w:r>
                     </w:p>
                     <w:p>
@@ -7332,43 +5591,7 @@
                           <w:szCs w:val="14"/>
                           <w:lang w:val="en-SG"/>
                         </w:rPr>
-                        <w:t xml:space="preserve">    </w:t>
-                      </w:r>
-                      <w:proofErr w:type="spellStart"/>
-                      <w:r>
-                        <w:rPr>
-                          <w:sz w:val="14"/>
-                          <w:szCs w:val="14"/>
-                          <w:lang w:val="en-SG"/>
-                        </w:rPr>
-                        <w:t>StaffID</w:t>
-                      </w:r>
-                      <w:proofErr w:type="spellEnd"/>
-                      <w:r>
-                        <w:rPr>
-                          <w:sz w:val="14"/>
-                          <w:szCs w:val="14"/>
-                          <w:lang w:val="en-SG"/>
-                        </w:rPr>
-                        <w:t xml:space="preserve"> </w:t>
-                      </w:r>
-                      <w:proofErr w:type="gramStart"/>
-                      <w:r>
-                        <w:rPr>
-                          <w:sz w:val="14"/>
-                          <w:szCs w:val="14"/>
-                          <w:lang w:val="en-SG"/>
-                        </w:rPr>
-                        <w:t>CHAR(</w:t>
-                      </w:r>
-                      <w:proofErr w:type="gramEnd"/>
-                      <w:r>
-                        <w:rPr>
-                          <w:sz w:val="14"/>
-                          <w:szCs w:val="14"/>
-                          <w:lang w:val="en-SG"/>
-                        </w:rPr>
-                        <w:t>10) PRIMARY KEY,</w:t>
+                        <w:t>    StaffID CHAR(10) PRIMARY KEY,</w:t>
                       </w:r>
                     </w:p>
                     <w:p>
@@ -7385,25 +5608,7 @@
                           <w:szCs w:val="14"/>
                           <w:lang w:val="en-SG"/>
                         </w:rPr>
-                        <w:t xml:space="preserve">    Name </w:t>
-                      </w:r>
-                      <w:proofErr w:type="gramStart"/>
-                      <w:r>
-                        <w:rPr>
-                          <w:sz w:val="14"/>
-                          <w:szCs w:val="14"/>
-                          <w:lang w:val="en-SG"/>
-                        </w:rPr>
-                        <w:t>VARCHAR(</w:t>
-                      </w:r>
-                      <w:proofErr w:type="gramEnd"/>
-                      <w:r>
-                        <w:rPr>
-                          <w:sz w:val="14"/>
-                          <w:szCs w:val="14"/>
-                          <w:lang w:val="en-SG"/>
-                        </w:rPr>
-                        <w:t>100) NOT NULL,</w:t>
+                        <w:t>    Name VARCHAR(100) NOT NULL,</w:t>
                       </w:r>
                     </w:p>
                     <w:p>
@@ -7420,25 +5625,7 @@
                           <w:szCs w:val="14"/>
                           <w:lang w:val="en-SG"/>
                         </w:rPr>
-                        <w:t xml:space="preserve">    Contact </w:t>
-                      </w:r>
-                      <w:proofErr w:type="gramStart"/>
-                      <w:r>
-                        <w:rPr>
-                          <w:sz w:val="14"/>
-                          <w:szCs w:val="14"/>
-                          <w:lang w:val="en-SG"/>
-                        </w:rPr>
-                        <w:t>VARCHAR(</w:t>
-                      </w:r>
-                      <w:proofErr w:type="gramEnd"/>
-                      <w:r>
-                        <w:rPr>
-                          <w:sz w:val="14"/>
-                          <w:szCs w:val="14"/>
-                          <w:lang w:val="en-SG"/>
-                        </w:rPr>
-                        <w:t>100) NOT NULL,</w:t>
+                        <w:t>    Contact VARCHAR(100) NOT NULL,</w:t>
                       </w:r>
                     </w:p>
                     <w:p>
@@ -7455,25 +5642,7 @@
                           <w:szCs w:val="14"/>
                           <w:lang w:val="en-SG"/>
                         </w:rPr>
-                        <w:t xml:space="preserve">    Gender </w:t>
-                      </w:r>
-                      <w:proofErr w:type="gramStart"/>
-                      <w:r>
-                        <w:rPr>
-                          <w:sz w:val="14"/>
-                          <w:szCs w:val="14"/>
-                          <w:lang w:val="en-SG"/>
-                        </w:rPr>
-                        <w:t>CHAR(</w:t>
-                      </w:r>
-                      <w:proofErr w:type="gramEnd"/>
-                      <w:r>
-                        <w:rPr>
-                          <w:sz w:val="14"/>
-                          <w:szCs w:val="14"/>
-                          <w:lang w:val="en-SG"/>
-                        </w:rPr>
-                        <w:t>1) NOT NULL,</w:t>
+                        <w:t>    Gender CHAR(1) NOT NULL,</w:t>
                       </w:r>
                     </w:p>
                     <w:p>
@@ -7490,43 +5659,7 @@
                           <w:szCs w:val="14"/>
                           <w:lang w:val="en-SG"/>
                         </w:rPr>
-                        <w:t xml:space="preserve">    </w:t>
-                      </w:r>
-                      <w:proofErr w:type="spellStart"/>
-                      <w:r>
-                        <w:rPr>
-                          <w:sz w:val="14"/>
-                          <w:szCs w:val="14"/>
-                          <w:lang w:val="en-SG"/>
-                        </w:rPr>
-                        <w:t>EmploymentType</w:t>
-                      </w:r>
-                      <w:proofErr w:type="spellEnd"/>
-                      <w:r>
-                        <w:rPr>
-                          <w:sz w:val="14"/>
-                          <w:szCs w:val="14"/>
-                          <w:lang w:val="en-SG"/>
-                        </w:rPr>
-                        <w:t xml:space="preserve"> </w:t>
-                      </w:r>
-                      <w:proofErr w:type="gramStart"/>
-                      <w:r>
-                        <w:rPr>
-                          <w:sz w:val="14"/>
-                          <w:szCs w:val="14"/>
-                          <w:lang w:val="en-SG"/>
-                        </w:rPr>
-                        <w:t>VARCHAR(</w:t>
-                      </w:r>
-                      <w:proofErr w:type="gramEnd"/>
-                      <w:r>
-                        <w:rPr>
-                          <w:sz w:val="14"/>
-                          <w:szCs w:val="14"/>
-                          <w:lang w:val="en-SG"/>
-                        </w:rPr>
-                        <w:t>20) NOT NULL,</w:t>
+                        <w:t>    EmploymentType VARCHAR(20) NOT NULL,</w:t>
                       </w:r>
                     </w:p>
                     <w:p>
@@ -7560,25 +5693,7 @@
                           <w:szCs w:val="14"/>
                           <w:lang w:val="en-SG"/>
                         </w:rPr>
-                        <w:t xml:space="preserve">    Department </w:t>
-                      </w:r>
-                      <w:proofErr w:type="gramStart"/>
-                      <w:r>
-                        <w:rPr>
-                          <w:sz w:val="14"/>
-                          <w:szCs w:val="14"/>
-                          <w:lang w:val="en-SG"/>
-                        </w:rPr>
-                        <w:t>VARCHAR(</w:t>
-                      </w:r>
-                      <w:proofErr w:type="gramEnd"/>
-                      <w:r>
-                        <w:rPr>
-                          <w:sz w:val="14"/>
-                          <w:szCs w:val="14"/>
-                          <w:lang w:val="en-SG"/>
-                        </w:rPr>
-                        <w:t>50) NOT NULL,</w:t>
+                        <w:t>    Department VARCHAR(50) NOT NULL,</w:t>
                       </w:r>
                     </w:p>
                     <w:p>
@@ -7655,43 +5770,7 @@
                           <w:szCs w:val="14"/>
                           <w:lang w:val="en-SG"/>
                         </w:rPr>
-                        <w:t xml:space="preserve">    </w:t>
-                      </w:r>
-                      <w:proofErr w:type="spellStart"/>
-                      <w:r>
-                        <w:rPr>
-                          <w:sz w:val="14"/>
-                          <w:szCs w:val="14"/>
-                          <w:lang w:val="en-SG"/>
-                        </w:rPr>
-                        <w:t>BookID</w:t>
-                      </w:r>
-                      <w:proofErr w:type="spellEnd"/>
-                      <w:r>
-                        <w:rPr>
-                          <w:sz w:val="14"/>
-                          <w:szCs w:val="14"/>
-                          <w:lang w:val="en-SG"/>
-                        </w:rPr>
-                        <w:t xml:space="preserve"> </w:t>
-                      </w:r>
-                      <w:proofErr w:type="gramStart"/>
-                      <w:r>
-                        <w:rPr>
-                          <w:sz w:val="14"/>
-                          <w:szCs w:val="14"/>
-                          <w:lang w:val="en-SG"/>
-                        </w:rPr>
-                        <w:t>CHAR(</w:t>
-                      </w:r>
-                      <w:proofErr w:type="gramEnd"/>
-                      <w:r>
-                        <w:rPr>
-                          <w:sz w:val="14"/>
-                          <w:szCs w:val="14"/>
-                          <w:lang w:val="en-SG"/>
-                        </w:rPr>
-                        <w:t>10) PRIMARY KEY,</w:t>
+                        <w:t>    BookID CHAR(10) PRIMARY KEY,</w:t>
                       </w:r>
                     </w:p>
                     <w:p>
@@ -7708,25 +5787,7 @@
                           <w:szCs w:val="14"/>
                           <w:lang w:val="en-SG"/>
                         </w:rPr>
-                        <w:t xml:space="preserve">    Title </w:t>
-                      </w:r>
-                      <w:proofErr w:type="gramStart"/>
-                      <w:r>
-                        <w:rPr>
-                          <w:sz w:val="14"/>
-                          <w:szCs w:val="14"/>
-                          <w:lang w:val="en-SG"/>
-                        </w:rPr>
-                        <w:t>VARCHAR(</w:t>
-                      </w:r>
-                      <w:proofErr w:type="gramEnd"/>
-                      <w:r>
-                        <w:rPr>
-                          <w:sz w:val="14"/>
-                          <w:szCs w:val="14"/>
-                          <w:lang w:val="en-SG"/>
-                        </w:rPr>
-                        <w:t>200) NOT NULL,</w:t>
+                        <w:t>    Title VARCHAR(200) NOT NULL,</w:t>
                       </w:r>
                     </w:p>
                     <w:p>
@@ -7743,25 +5804,7 @@
                           <w:szCs w:val="14"/>
                           <w:lang w:val="en-SG"/>
                         </w:rPr>
-                        <w:t xml:space="preserve">    Author </w:t>
-                      </w:r>
-                      <w:proofErr w:type="gramStart"/>
-                      <w:r>
-                        <w:rPr>
-                          <w:sz w:val="14"/>
-                          <w:szCs w:val="14"/>
-                          <w:lang w:val="en-SG"/>
-                        </w:rPr>
-                        <w:t>VARCHAR(</w:t>
-                      </w:r>
-                      <w:proofErr w:type="gramEnd"/>
-                      <w:r>
-                        <w:rPr>
-                          <w:sz w:val="14"/>
-                          <w:szCs w:val="14"/>
-                          <w:lang w:val="en-SG"/>
-                        </w:rPr>
-                        <w:t>100) NOT NULL,</w:t>
+                        <w:t>    Author VARCHAR(100) NOT NULL,</w:t>
                       </w:r>
                     </w:p>
                     <w:p>
@@ -7778,25 +5821,7 @@
                           <w:szCs w:val="14"/>
                           <w:lang w:val="en-SG"/>
                         </w:rPr>
-                        <w:t xml:space="preserve">    Genre </w:t>
-                      </w:r>
-                      <w:proofErr w:type="gramStart"/>
-                      <w:r>
-                        <w:rPr>
-                          <w:sz w:val="14"/>
-                          <w:szCs w:val="14"/>
-                          <w:lang w:val="en-SG"/>
-                        </w:rPr>
-                        <w:t>VARCHAR(</w:t>
-                      </w:r>
-                      <w:proofErr w:type="gramEnd"/>
-                      <w:r>
-                        <w:rPr>
-                          <w:sz w:val="14"/>
-                          <w:szCs w:val="14"/>
-                          <w:lang w:val="en-SG"/>
-                        </w:rPr>
-                        <w:t>50) NOT NULL,</w:t>
+                        <w:t>    Genre VARCHAR(50) NOT NULL,</w:t>
                       </w:r>
                     </w:p>
                     <w:p>
@@ -7813,43 +5838,7 @@
                           <w:szCs w:val="14"/>
                           <w:lang w:val="en-SG"/>
                         </w:rPr>
-                        <w:t xml:space="preserve">    </w:t>
-                      </w:r>
-                      <w:proofErr w:type="spellStart"/>
-                      <w:r>
-                        <w:rPr>
-                          <w:sz w:val="14"/>
-                          <w:szCs w:val="14"/>
-                          <w:lang w:val="en-SG"/>
-                        </w:rPr>
-                        <w:t>MinTierID</w:t>
-                      </w:r>
-                      <w:proofErr w:type="spellEnd"/>
-                      <w:r>
-                        <w:rPr>
-                          <w:sz w:val="14"/>
-                          <w:szCs w:val="14"/>
-                          <w:lang w:val="en-SG"/>
-                        </w:rPr>
-                        <w:t xml:space="preserve"> </w:t>
-                      </w:r>
-                      <w:proofErr w:type="gramStart"/>
-                      <w:r>
-                        <w:rPr>
-                          <w:sz w:val="14"/>
-                          <w:szCs w:val="14"/>
-                          <w:lang w:val="en-SG"/>
-                        </w:rPr>
-                        <w:t>CHAR(</w:t>
-                      </w:r>
-                      <w:proofErr w:type="gramEnd"/>
-                      <w:r>
-                        <w:rPr>
-                          <w:sz w:val="14"/>
-                          <w:szCs w:val="14"/>
-                          <w:lang w:val="en-SG"/>
-                        </w:rPr>
-                        <w:t>5) NOT NULL,</w:t>
+                        <w:t>    MinTierID CHAR(5) NOT NULL,</w:t>
                       </w:r>
                     </w:p>
                     <w:p>
@@ -7866,63 +5855,7 @@
                           <w:szCs w:val="14"/>
                           <w:lang w:val="en-SG"/>
                         </w:rPr>
-                        <w:t>    FOREIGN KEY (</w:t>
-                      </w:r>
-                      <w:proofErr w:type="spellStart"/>
-                      <w:r>
-                        <w:rPr>
-                          <w:sz w:val="14"/>
-                          <w:szCs w:val="14"/>
-                          <w:lang w:val="en-SG"/>
-                        </w:rPr>
-                        <w:t>MinTierID</w:t>
-                      </w:r>
-                      <w:proofErr w:type="spellEnd"/>
-                      <w:r>
-                        <w:rPr>
-                          <w:sz w:val="14"/>
-                          <w:szCs w:val="14"/>
-                          <w:lang w:val="en-SG"/>
-                        </w:rPr>
-                        <w:t xml:space="preserve">) REFERENCES </w:t>
-                      </w:r>
-                      <w:proofErr w:type="spellStart"/>
-                      <w:proofErr w:type="gramStart"/>
-                      <w:r>
-                        <w:rPr>
-                          <w:sz w:val="14"/>
-                          <w:szCs w:val="14"/>
-                          <w:lang w:val="en-SG"/>
-                        </w:rPr>
-                        <w:t>MembershipTier</w:t>
-                      </w:r>
-                      <w:proofErr w:type="spellEnd"/>
-                      <w:r>
-                        <w:rPr>
-                          <w:sz w:val="14"/>
-                          <w:szCs w:val="14"/>
-                          <w:lang w:val="en-SG"/>
-                        </w:rPr>
-                        <w:t>(</w:t>
-                      </w:r>
-                      <w:proofErr w:type="spellStart"/>
-                      <w:proofErr w:type="gramEnd"/>
-                      <w:r>
-                        <w:rPr>
-                          <w:sz w:val="14"/>
-                          <w:szCs w:val="14"/>
-                          <w:lang w:val="en-SG"/>
-                        </w:rPr>
-                        <w:t>TierID</w:t>
-                      </w:r>
-                      <w:proofErr w:type="spellEnd"/>
-                      <w:r>
-                        <w:rPr>
-                          <w:sz w:val="14"/>
-                          <w:szCs w:val="14"/>
-                          <w:lang w:val="en-SG"/>
-                        </w:rPr>
-                        <w:t>)</w:t>
+                        <w:t>    FOREIGN KEY (MinTierID) REFERENCES MembershipTier(TierID)</w:t>
                       </w:r>
                     </w:p>
                     <w:p>
@@ -7965,25 +5898,7 @@
                           <w:szCs w:val="14"/>
                           <w:lang w:val="en-SG"/>
                         </w:rPr>
-                        <w:t xml:space="preserve">CREATE TABLE </w:t>
-                      </w:r>
-                      <w:proofErr w:type="spellStart"/>
-                      <w:r>
-                        <w:rPr>
-                          <w:sz w:val="14"/>
-                          <w:szCs w:val="14"/>
-                          <w:lang w:val="en-SG"/>
-                        </w:rPr>
-                        <w:t>BookCopy</w:t>
-                      </w:r>
-                      <w:proofErr w:type="spellEnd"/>
-                      <w:r>
-                        <w:rPr>
-                          <w:sz w:val="14"/>
-                          <w:szCs w:val="14"/>
-                          <w:lang w:val="en-SG"/>
-                        </w:rPr>
-                        <w:t xml:space="preserve"> (</w:t>
+                        <w:t>CREATE TABLE BookCopy (</w:t>
                       </w:r>
                     </w:p>
                     <w:p>
@@ -8000,43 +5915,7 @@
                           <w:szCs w:val="14"/>
                           <w:lang w:val="en-SG"/>
                         </w:rPr>
-                        <w:t xml:space="preserve">    </w:t>
-                      </w:r>
-                      <w:proofErr w:type="spellStart"/>
-                      <w:r>
-                        <w:rPr>
-                          <w:sz w:val="14"/>
-                          <w:szCs w:val="14"/>
-                          <w:lang w:val="en-SG"/>
-                        </w:rPr>
-                        <w:t>BookID</w:t>
-                      </w:r>
-                      <w:proofErr w:type="spellEnd"/>
-                      <w:r>
-                        <w:rPr>
-                          <w:sz w:val="14"/>
-                          <w:szCs w:val="14"/>
-                          <w:lang w:val="en-SG"/>
-                        </w:rPr>
-                        <w:t xml:space="preserve"> </w:t>
-                      </w:r>
-                      <w:proofErr w:type="gramStart"/>
-                      <w:r>
-                        <w:rPr>
-                          <w:sz w:val="14"/>
-                          <w:szCs w:val="14"/>
-                          <w:lang w:val="en-SG"/>
-                        </w:rPr>
-                        <w:t>CHAR(</w:t>
-                      </w:r>
-                      <w:proofErr w:type="gramEnd"/>
-                      <w:r>
-                        <w:rPr>
-                          <w:sz w:val="14"/>
-                          <w:szCs w:val="14"/>
-                          <w:lang w:val="en-SG"/>
-                        </w:rPr>
-                        <w:t>10) NOT NULL,</w:t>
+                        <w:t>    BookID CHAR(10) NOT NULL,</w:t>
                       </w:r>
                     </w:p>
                     <w:p>
@@ -8053,25 +5932,7 @@
                           <w:szCs w:val="14"/>
                           <w:lang w:val="en-SG"/>
                         </w:rPr>
-                        <w:t xml:space="preserve">    </w:t>
-                      </w:r>
-                      <w:proofErr w:type="spellStart"/>
-                      <w:r>
-                        <w:rPr>
-                          <w:sz w:val="14"/>
-                          <w:szCs w:val="14"/>
-                          <w:lang w:val="en-SG"/>
-                        </w:rPr>
-                        <w:t>CopySeqNo</w:t>
-                      </w:r>
-                      <w:proofErr w:type="spellEnd"/>
-                      <w:r>
-                        <w:rPr>
-                          <w:sz w:val="14"/>
-                          <w:szCs w:val="14"/>
-                          <w:lang w:val="en-SG"/>
-                        </w:rPr>
-                        <w:t xml:space="preserve"> INT NOT NULL,</w:t>
+                        <w:t>    CopySeqNo INT NOT NULL,</w:t>
                       </w:r>
                     </w:p>
                     <w:p>
@@ -8088,25 +5949,7 @@
                           <w:szCs w:val="14"/>
                           <w:lang w:val="en-SG"/>
                         </w:rPr>
-                        <w:t xml:space="preserve">    Status </w:t>
-                      </w:r>
-                      <w:proofErr w:type="gramStart"/>
-                      <w:r>
-                        <w:rPr>
-                          <w:sz w:val="14"/>
-                          <w:szCs w:val="14"/>
-                          <w:lang w:val="en-SG"/>
-                        </w:rPr>
-                        <w:t>VARCHAR(</w:t>
-                      </w:r>
-                      <w:proofErr w:type="gramEnd"/>
-                      <w:r>
-                        <w:rPr>
-                          <w:sz w:val="14"/>
-                          <w:szCs w:val="14"/>
-                          <w:lang w:val="en-SG"/>
-                        </w:rPr>
-                        <w:t>20) NOT NULL,</w:t>
+                        <w:t>    Status VARCHAR(20) NOT NULL,</w:t>
                       </w:r>
                     </w:p>
                     <w:p>
@@ -8123,43 +5966,7 @@
                           <w:szCs w:val="14"/>
                           <w:lang w:val="en-SG"/>
                         </w:rPr>
-                        <w:t>    PRIMARY KEY (</w:t>
-                      </w:r>
-                      <w:proofErr w:type="spellStart"/>
-                      <w:r>
-                        <w:rPr>
-                          <w:sz w:val="14"/>
-                          <w:szCs w:val="14"/>
-                          <w:lang w:val="en-SG"/>
-                        </w:rPr>
-                        <w:t>BookID</w:t>
-                      </w:r>
-                      <w:proofErr w:type="spellEnd"/>
-                      <w:r>
-                        <w:rPr>
-                          <w:sz w:val="14"/>
-                          <w:szCs w:val="14"/>
-                          <w:lang w:val="en-SG"/>
-                        </w:rPr>
-                        <w:t xml:space="preserve">, </w:t>
-                      </w:r>
-                      <w:proofErr w:type="spellStart"/>
-                      <w:r>
-                        <w:rPr>
-                          <w:sz w:val="14"/>
-                          <w:szCs w:val="14"/>
-                          <w:lang w:val="en-SG"/>
-                        </w:rPr>
-                        <w:t>CopySeqNo</w:t>
-                      </w:r>
-                      <w:proofErr w:type="spellEnd"/>
-                      <w:r>
-                        <w:rPr>
-                          <w:sz w:val="14"/>
-                          <w:szCs w:val="14"/>
-                          <w:lang w:val="en-SG"/>
-                        </w:rPr>
-                        <w:t>),</w:t>
+                        <w:t>    PRIMARY KEY (BookID, CopySeqNo),</w:t>
                       </w:r>
                     </w:p>
                     <w:p>
@@ -8176,53 +5983,7 @@
                           <w:szCs w:val="14"/>
                           <w:lang w:val="en-SG"/>
                         </w:rPr>
-                        <w:t>    FOREIGN KEY (</w:t>
-                      </w:r>
-                      <w:proofErr w:type="spellStart"/>
-                      <w:r>
-                        <w:rPr>
-                          <w:sz w:val="14"/>
-                          <w:szCs w:val="14"/>
-                          <w:lang w:val="en-SG"/>
-                        </w:rPr>
-                        <w:t>BookID</w:t>
-                      </w:r>
-                      <w:proofErr w:type="spellEnd"/>
-                      <w:r>
-                        <w:rPr>
-                          <w:sz w:val="14"/>
-                          <w:szCs w:val="14"/>
-                          <w:lang w:val="en-SG"/>
-                        </w:rPr>
-                        <w:t xml:space="preserve">) REFERENCES </w:t>
-                      </w:r>
-                      <w:proofErr w:type="gramStart"/>
-                      <w:r>
-                        <w:rPr>
-                          <w:sz w:val="14"/>
-                          <w:szCs w:val="14"/>
-                          <w:lang w:val="en-SG"/>
-                        </w:rPr>
-                        <w:t>Book(</w:t>
-                      </w:r>
-                      <w:proofErr w:type="spellStart"/>
-                      <w:proofErr w:type="gramEnd"/>
-                      <w:r>
-                        <w:rPr>
-                          <w:sz w:val="14"/>
-                          <w:szCs w:val="14"/>
-                          <w:lang w:val="en-SG"/>
-                        </w:rPr>
-                        <w:t>BookID</w:t>
-                      </w:r>
-                      <w:proofErr w:type="spellEnd"/>
-                      <w:r>
-                        <w:rPr>
-                          <w:sz w:val="14"/>
-                          <w:szCs w:val="14"/>
-                          <w:lang w:val="en-SG"/>
-                        </w:rPr>
-                        <w:t>)</w:t>
+                        <w:t>    FOREIGN KEY (BookID) REFERENCES Book(BookID)</w:t>
                       </w:r>
                     </w:p>
                     <w:p>
@@ -8282,43 +6043,7 @@
                           <w:szCs w:val="14"/>
                           <w:lang w:val="en-SG"/>
                         </w:rPr>
-                        <w:t xml:space="preserve">    </w:t>
-                      </w:r>
-                      <w:proofErr w:type="spellStart"/>
-                      <w:r>
-                        <w:rPr>
-                          <w:sz w:val="14"/>
-                          <w:szCs w:val="14"/>
-                          <w:lang w:val="en-SG"/>
-                        </w:rPr>
-                        <w:t>MemberID</w:t>
-                      </w:r>
-                      <w:proofErr w:type="spellEnd"/>
-                      <w:r>
-                        <w:rPr>
-                          <w:sz w:val="14"/>
-                          <w:szCs w:val="14"/>
-                          <w:lang w:val="en-SG"/>
-                        </w:rPr>
-                        <w:t xml:space="preserve"> </w:t>
-                      </w:r>
-                      <w:proofErr w:type="gramStart"/>
-                      <w:r>
-                        <w:rPr>
-                          <w:sz w:val="14"/>
-                          <w:szCs w:val="14"/>
-                          <w:lang w:val="en-SG"/>
-                        </w:rPr>
-                        <w:t>CHAR(</w:t>
-                      </w:r>
-                      <w:proofErr w:type="gramEnd"/>
-                      <w:r>
-                        <w:rPr>
-                          <w:sz w:val="14"/>
-                          <w:szCs w:val="14"/>
-                          <w:lang w:val="en-SG"/>
-                        </w:rPr>
-                        <w:t>10) NOT NULL,</w:t>
+                        <w:t>    MemberID CHAR(10) NOT NULL,</w:t>
                       </w:r>
                     </w:p>
                     <w:p>
@@ -8335,43 +6060,7 @@
                           <w:szCs w:val="14"/>
                           <w:lang w:val="en-SG"/>
                         </w:rPr>
-                        <w:t xml:space="preserve">    </w:t>
-                      </w:r>
-                      <w:proofErr w:type="spellStart"/>
-                      <w:r>
-                        <w:rPr>
-                          <w:sz w:val="14"/>
-                          <w:szCs w:val="14"/>
-                          <w:lang w:val="en-SG"/>
-                        </w:rPr>
-                        <w:t>StaffID</w:t>
-                      </w:r>
-                      <w:proofErr w:type="spellEnd"/>
-                      <w:r>
-                        <w:rPr>
-                          <w:sz w:val="14"/>
-                          <w:szCs w:val="14"/>
-                          <w:lang w:val="en-SG"/>
-                        </w:rPr>
-                        <w:t xml:space="preserve"> </w:t>
-                      </w:r>
-                      <w:proofErr w:type="gramStart"/>
-                      <w:r>
-                        <w:rPr>
-                          <w:sz w:val="14"/>
-                          <w:szCs w:val="14"/>
-                          <w:lang w:val="en-SG"/>
-                        </w:rPr>
-                        <w:t>CHAR(</w:t>
-                      </w:r>
-                      <w:proofErr w:type="gramEnd"/>
-                      <w:r>
-                        <w:rPr>
-                          <w:sz w:val="14"/>
-                          <w:szCs w:val="14"/>
-                          <w:lang w:val="en-SG"/>
-                        </w:rPr>
-                        <w:t>10) NOT NULL,</w:t>
+                        <w:t>    StaffID CHAR(10) NOT NULL,</w:t>
                       </w:r>
                     </w:p>
                     <w:p>
@@ -8388,43 +6077,7 @@
                           <w:szCs w:val="14"/>
                           <w:lang w:val="en-SG"/>
                         </w:rPr>
-                        <w:t xml:space="preserve">    </w:t>
-                      </w:r>
-                      <w:proofErr w:type="spellStart"/>
-                      <w:r>
-                        <w:rPr>
-                          <w:sz w:val="14"/>
-                          <w:szCs w:val="14"/>
-                          <w:lang w:val="en-SG"/>
-                        </w:rPr>
-                        <w:t>BookID</w:t>
-                      </w:r>
-                      <w:proofErr w:type="spellEnd"/>
-                      <w:r>
-                        <w:rPr>
-                          <w:sz w:val="14"/>
-                          <w:szCs w:val="14"/>
-                          <w:lang w:val="en-SG"/>
-                        </w:rPr>
-                        <w:t xml:space="preserve"> </w:t>
-                      </w:r>
-                      <w:proofErr w:type="gramStart"/>
-                      <w:r>
-                        <w:rPr>
-                          <w:sz w:val="14"/>
-                          <w:szCs w:val="14"/>
-                          <w:lang w:val="en-SG"/>
-                        </w:rPr>
-                        <w:t>CHAR(</w:t>
-                      </w:r>
-                      <w:proofErr w:type="gramEnd"/>
-                      <w:r>
-                        <w:rPr>
-                          <w:sz w:val="14"/>
-                          <w:szCs w:val="14"/>
-                          <w:lang w:val="en-SG"/>
-                        </w:rPr>
-                        <w:t>10) NOT NULL,</w:t>
+                        <w:t>    BookID CHAR(10) NOT NULL,</w:t>
                       </w:r>
                     </w:p>
                     <w:p>
@@ -8441,25 +6094,7 @@
                           <w:szCs w:val="14"/>
                           <w:lang w:val="en-SG"/>
                         </w:rPr>
-                        <w:t xml:space="preserve">    </w:t>
-                      </w:r>
-                      <w:proofErr w:type="spellStart"/>
-                      <w:r>
-                        <w:rPr>
-                          <w:sz w:val="14"/>
-                          <w:szCs w:val="14"/>
-                          <w:lang w:val="en-SG"/>
-                        </w:rPr>
-                        <w:t>CopySeqNo</w:t>
-                      </w:r>
-                      <w:proofErr w:type="spellEnd"/>
-                      <w:r>
-                        <w:rPr>
-                          <w:sz w:val="14"/>
-                          <w:szCs w:val="14"/>
-                          <w:lang w:val="en-SG"/>
-                        </w:rPr>
-                        <w:t xml:space="preserve"> INT NOT NULL,</w:t>
+                        <w:t>    CopySeqNo INT NOT NULL,</w:t>
                       </w:r>
                     </w:p>
                     <w:p>
@@ -8493,25 +6128,7 @@
                           <w:szCs w:val="14"/>
                           <w:lang w:val="en-SG"/>
                         </w:rPr>
-                        <w:t xml:space="preserve">    </w:t>
-                      </w:r>
-                      <w:proofErr w:type="spellStart"/>
-                      <w:r>
-                        <w:rPr>
-                          <w:sz w:val="14"/>
-                          <w:szCs w:val="14"/>
-                          <w:lang w:val="en-SG"/>
-                        </w:rPr>
-                        <w:t>DueDate</w:t>
-                      </w:r>
-                      <w:proofErr w:type="spellEnd"/>
-                      <w:r>
-                        <w:rPr>
-                          <w:sz w:val="14"/>
-                          <w:szCs w:val="14"/>
-                          <w:lang w:val="en-SG"/>
-                        </w:rPr>
-                        <w:t xml:space="preserve"> DATE NOT NULL,</w:t>
+                        <w:t>    DueDate DATE NOT NULL,</w:t>
                       </w:r>
                     </w:p>
                     <w:p>
@@ -8528,25 +6145,7 @@
                           <w:szCs w:val="14"/>
                           <w:lang w:val="en-SG"/>
                         </w:rPr>
-                        <w:t xml:space="preserve">    </w:t>
-                      </w:r>
-                      <w:proofErr w:type="spellStart"/>
-                      <w:r>
-                        <w:rPr>
-                          <w:sz w:val="14"/>
-                          <w:szCs w:val="14"/>
-                          <w:lang w:val="en-SG"/>
-                        </w:rPr>
-                        <w:t>ReturnDatetime</w:t>
-                      </w:r>
-                      <w:proofErr w:type="spellEnd"/>
-                      <w:r>
-                        <w:rPr>
-                          <w:sz w:val="14"/>
-                          <w:szCs w:val="14"/>
-                          <w:lang w:val="en-SG"/>
-                        </w:rPr>
-                        <w:t xml:space="preserve"> DATETIME NULL,</w:t>
+                        <w:t>    ReturnDatetime DATETIME NULL,</w:t>
                       </w:r>
                     </w:p>
                     <w:p>
@@ -8563,61 +6162,7 @@
                           <w:szCs w:val="14"/>
                           <w:lang w:val="en-SG"/>
                         </w:rPr>
-                        <w:t>    PRIMARY KEY (</w:t>
-                      </w:r>
-                      <w:proofErr w:type="spellStart"/>
-                      <w:r>
-                        <w:rPr>
-                          <w:sz w:val="14"/>
-                          <w:szCs w:val="14"/>
-                          <w:lang w:val="en-SG"/>
-                        </w:rPr>
-                        <w:t>MemberID</w:t>
-                      </w:r>
-                      <w:proofErr w:type="spellEnd"/>
-                      <w:r>
-                        <w:rPr>
-                          <w:sz w:val="14"/>
-                          <w:szCs w:val="14"/>
-                          <w:lang w:val="en-SG"/>
-                        </w:rPr>
-                        <w:t xml:space="preserve">, </w:t>
-                      </w:r>
-                      <w:proofErr w:type="spellStart"/>
-                      <w:r>
-                        <w:rPr>
-                          <w:sz w:val="14"/>
-                          <w:szCs w:val="14"/>
-                          <w:lang w:val="en-SG"/>
-                        </w:rPr>
-                        <w:t>BookID</w:t>
-                      </w:r>
-                      <w:proofErr w:type="spellEnd"/>
-                      <w:r>
-                        <w:rPr>
-                          <w:sz w:val="14"/>
-                          <w:szCs w:val="14"/>
-                          <w:lang w:val="en-SG"/>
-                        </w:rPr>
-                        <w:t xml:space="preserve">, </w:t>
-                      </w:r>
-                      <w:proofErr w:type="spellStart"/>
-                      <w:r>
-                        <w:rPr>
-                          <w:sz w:val="14"/>
-                          <w:szCs w:val="14"/>
-                          <w:lang w:val="en-SG"/>
-                        </w:rPr>
-                        <w:t>CopySeqNo</w:t>
-                      </w:r>
-                      <w:proofErr w:type="spellEnd"/>
-                      <w:r>
-                        <w:rPr>
-                          <w:sz w:val="14"/>
-                          <w:szCs w:val="14"/>
-                          <w:lang w:val="en-SG"/>
-                        </w:rPr>
-                        <w:t>, StartDatetime),</w:t>
+                        <w:t>    PRIMARY KEY (MemberID, BookID, CopySeqNo, StartDatetime),</w:t>
                       </w:r>
                     </w:p>
                     <w:p>
@@ -8634,53 +6179,7 @@
                           <w:szCs w:val="14"/>
                           <w:lang w:val="en-SG"/>
                         </w:rPr>
-                        <w:t>    FOREIGN KEY (</w:t>
-                      </w:r>
-                      <w:proofErr w:type="spellStart"/>
-                      <w:r>
-                        <w:rPr>
-                          <w:sz w:val="14"/>
-                          <w:szCs w:val="14"/>
-                          <w:lang w:val="en-SG"/>
-                        </w:rPr>
-                        <w:t>MemberID</w:t>
-                      </w:r>
-                      <w:proofErr w:type="spellEnd"/>
-                      <w:r>
-                        <w:rPr>
-                          <w:sz w:val="14"/>
-                          <w:szCs w:val="14"/>
-                          <w:lang w:val="en-SG"/>
-                        </w:rPr>
-                        <w:t xml:space="preserve">) REFERENCES </w:t>
-                      </w:r>
-                      <w:proofErr w:type="gramStart"/>
-                      <w:r>
-                        <w:rPr>
-                          <w:sz w:val="14"/>
-                          <w:szCs w:val="14"/>
-                          <w:lang w:val="en-SG"/>
-                        </w:rPr>
-                        <w:t>Member(</w:t>
-                      </w:r>
-                      <w:proofErr w:type="spellStart"/>
-                      <w:proofErr w:type="gramEnd"/>
-                      <w:r>
-                        <w:rPr>
-                          <w:sz w:val="14"/>
-                          <w:szCs w:val="14"/>
-                          <w:lang w:val="en-SG"/>
-                        </w:rPr>
-                        <w:t>MemberID</w:t>
-                      </w:r>
-                      <w:proofErr w:type="spellEnd"/>
-                      <w:r>
-                        <w:rPr>
-                          <w:sz w:val="14"/>
-                          <w:szCs w:val="14"/>
-                          <w:lang w:val="en-SG"/>
-                        </w:rPr>
-                        <w:t>),</w:t>
+                        <w:t>    FOREIGN KEY (MemberID) REFERENCES Member(MemberID),</w:t>
                       </w:r>
                     </w:p>
                     <w:p>
@@ -8697,53 +6196,7 @@
                           <w:szCs w:val="14"/>
                           <w:lang w:val="en-SG"/>
                         </w:rPr>
-                        <w:t>    FOREIGN KEY (</w:t>
-                      </w:r>
-                      <w:proofErr w:type="spellStart"/>
-                      <w:r>
-                        <w:rPr>
-                          <w:sz w:val="14"/>
-                          <w:szCs w:val="14"/>
-                          <w:lang w:val="en-SG"/>
-                        </w:rPr>
-                        <w:t>StaffID</w:t>
-                      </w:r>
-                      <w:proofErr w:type="spellEnd"/>
-                      <w:r>
-                        <w:rPr>
-                          <w:sz w:val="14"/>
-                          <w:szCs w:val="14"/>
-                          <w:lang w:val="en-SG"/>
-                        </w:rPr>
-                        <w:t xml:space="preserve">) REFERENCES </w:t>
-                      </w:r>
-                      <w:proofErr w:type="gramStart"/>
-                      <w:r>
-                        <w:rPr>
-                          <w:sz w:val="14"/>
-                          <w:szCs w:val="14"/>
-                          <w:lang w:val="en-SG"/>
-                        </w:rPr>
-                        <w:t>Staff(</w:t>
-                      </w:r>
-                      <w:proofErr w:type="spellStart"/>
-                      <w:proofErr w:type="gramEnd"/>
-                      <w:r>
-                        <w:rPr>
-                          <w:sz w:val="14"/>
-                          <w:szCs w:val="14"/>
-                          <w:lang w:val="en-SG"/>
-                        </w:rPr>
-                        <w:t>StaffID</w:t>
-                      </w:r>
-                      <w:proofErr w:type="spellEnd"/>
-                      <w:r>
-                        <w:rPr>
-                          <w:sz w:val="14"/>
-                          <w:szCs w:val="14"/>
-                          <w:lang w:val="en-SG"/>
-                        </w:rPr>
-                        <w:t>),</w:t>
+                        <w:t>    FOREIGN KEY (StaffID) REFERENCES Staff(StaffID),</w:t>
                       </w:r>
                     </w:p>
                     <w:p>
@@ -8760,99 +6213,7 @@
                           <w:szCs w:val="14"/>
                           <w:lang w:val="en-SG"/>
                         </w:rPr>
-                        <w:t>    FOREIGN KEY (</w:t>
-                      </w:r>
-                      <w:proofErr w:type="spellStart"/>
-                      <w:r>
-                        <w:rPr>
-                          <w:sz w:val="14"/>
-                          <w:szCs w:val="14"/>
-                          <w:lang w:val="en-SG"/>
-                        </w:rPr>
-                        <w:t>BookID</w:t>
-                      </w:r>
-                      <w:proofErr w:type="spellEnd"/>
-                      <w:r>
-                        <w:rPr>
-                          <w:sz w:val="14"/>
-                          <w:szCs w:val="14"/>
-                          <w:lang w:val="en-SG"/>
-                        </w:rPr>
-                        <w:t xml:space="preserve">, </w:t>
-                      </w:r>
-                      <w:proofErr w:type="spellStart"/>
-                      <w:r>
-                        <w:rPr>
-                          <w:sz w:val="14"/>
-                          <w:szCs w:val="14"/>
-                          <w:lang w:val="en-SG"/>
-                        </w:rPr>
-                        <w:t>CopySeqNo</w:t>
-                      </w:r>
-                      <w:proofErr w:type="spellEnd"/>
-                      <w:r>
-                        <w:rPr>
-                          <w:sz w:val="14"/>
-                          <w:szCs w:val="14"/>
-                          <w:lang w:val="en-SG"/>
-                        </w:rPr>
-                        <w:t xml:space="preserve">) REFERENCES </w:t>
-                      </w:r>
-                      <w:proofErr w:type="spellStart"/>
-                      <w:proofErr w:type="gramStart"/>
-                      <w:r>
-                        <w:rPr>
-                          <w:sz w:val="14"/>
-                          <w:szCs w:val="14"/>
-                          <w:lang w:val="en-SG"/>
-                        </w:rPr>
-                        <w:t>BookCopy</w:t>
-                      </w:r>
-                      <w:proofErr w:type="spellEnd"/>
-                      <w:r>
-                        <w:rPr>
-                          <w:sz w:val="14"/>
-                          <w:szCs w:val="14"/>
-                          <w:lang w:val="en-SG"/>
-                        </w:rPr>
-                        <w:t>(</w:t>
-                      </w:r>
-                      <w:proofErr w:type="spellStart"/>
-                      <w:proofErr w:type="gramEnd"/>
-                      <w:r>
-                        <w:rPr>
-                          <w:sz w:val="14"/>
-                          <w:szCs w:val="14"/>
-                          <w:lang w:val="en-SG"/>
-                        </w:rPr>
-                        <w:t>BookID</w:t>
-                      </w:r>
-                      <w:proofErr w:type="spellEnd"/>
-                      <w:r>
-                        <w:rPr>
-                          <w:sz w:val="14"/>
-                          <w:szCs w:val="14"/>
-                          <w:lang w:val="en-SG"/>
-                        </w:rPr>
-                        <w:t xml:space="preserve">, </w:t>
-                      </w:r>
-                      <w:proofErr w:type="spellStart"/>
-                      <w:r>
-                        <w:rPr>
-                          <w:sz w:val="14"/>
-                          <w:szCs w:val="14"/>
-                          <w:lang w:val="en-SG"/>
-                        </w:rPr>
-                        <w:t>CopySeqNo</w:t>
-                      </w:r>
-                      <w:proofErr w:type="spellEnd"/>
-                      <w:r>
-                        <w:rPr>
-                          <w:sz w:val="14"/>
-                          <w:szCs w:val="14"/>
-                          <w:lang w:val="en-SG"/>
-                        </w:rPr>
-                        <w:t>)</w:t>
+                        <w:t>    FOREIGN KEY (BookID, CopySeqNo) REFERENCES BookCopy(BookID, CopySeqNo)</w:t>
                       </w:r>
                     </w:p>
                     <w:p>
@@ -8922,15 +6283,7 @@
         <w:t xml:space="preserve"> if group size is 4.</w:t>
       </w:r>
       <w:r>
-        <w:t xml:space="preserve"> Separately submit all your queries in </w:t>
-      </w:r>
-      <w:proofErr w:type="spellStart"/>
-      <w:r>
-        <w:t>DW_query.sql</w:t>
-      </w:r>
-      <w:proofErr w:type="spellEnd"/>
-      <w:r>
-        <w:t xml:space="preserve">. (So do not include </w:t>
+        <w:t xml:space="preserve"> Separately submit all your queries in DW_query.sql. (So do not include </w:t>
       </w:r>
       <w:r>
         <w:t>your</w:t>
@@ -14182,7 +11535,7 @@
   <w:docDefaults>
     <w:rPrDefault>
       <w:rPr>
-        <w:rFonts w:ascii="Times New Roman" w:eastAsia="Times New Roman" w:hAnsi="Times New Roman" w:cs="Times New Roman"/>
+        <w:rFonts w:ascii="Times New Roman" w:eastAsiaTheme="minorEastAsia" w:hAnsi="Times New Roman" w:cs="Times New Roman"/>
         <w:lang w:val="en-SG" w:eastAsia="zh-CN" w:bidi="ar-SA"/>
       </w:rPr>
     </w:rPrDefault>
@@ -15341,7 +12694,7 @@
     <w:qFormat/>
     <w:rsid w:val="00B41D3F"/>
     <w:rPr>
-      <w:rFonts w:asciiTheme="minorHAnsi" w:eastAsiaTheme="minorEastAsia" w:hAnsiTheme="minorHAnsi" w:cstheme="minorBidi"/>
+      <w:rFonts w:asciiTheme="minorHAnsi" w:hAnsiTheme="minorHAnsi" w:cstheme="minorBidi"/>
       <w:sz w:val="22"/>
       <w:szCs w:val="22"/>
       <w:lang w:val="en-US" w:eastAsia="en-US"/>
@@ -16487,32 +13840,10 @@
 </file>
 
 <file path=customXml/item1.xml><?xml version="1.0" encoding="utf-8"?>
-<p:properties xmlns:p="http://schemas.microsoft.com/office/2006/metadata/properties" xmlns:xsi="http://www.w3.org/2001/XMLSchema-instance" xmlns:pc="http://schemas.microsoft.com/office/infopath/2007/PartnerControls">
-  <documentManagement>
-    <_ip_UnifiedCompliancePolicyUIAction xmlns="http://schemas.microsoft.com/sharepoint/v3" xsi:nil="true"/>
-    <lcf76f155ced4ddcb4097134ff3c332f xmlns="72f5c66d-4f9b-4523-9c59-0147434cba56">
-      <Terms xmlns="http://schemas.microsoft.com/office/infopath/2007/PartnerControls"/>
-    </lcf76f155ced4ddcb4097134ff3c332f>
-    <TaxCatchAll xmlns="d5671106-6e7e-4942-8aee-9bcd5dd7e66b" xsi:nil="true"/>
-    <_ip_UnifiedCompliancePolicyProperties xmlns="http://schemas.microsoft.com/sharepoint/v3" xsi:nil="true"/>
-  </documentManagement>
-</p:properties>
+<b:Sources xmlns:b="http://schemas.openxmlformats.org/officeDocument/2006/bibliography" xmlns="http://schemas.openxmlformats.org/officeDocument/2006/bibliography" SelectedStyle="\MLA.XSL" StyleName="MLA"/>
 </file>
 
 <file path=customXml/item2.xml><?xml version="1.0" encoding="utf-8"?>
-<?mso-contentType ?>
-<FormTemplates xmlns="http://schemas.microsoft.com/sharepoint/v3/contenttype/forms">
-  <Display>DocumentLibraryForm</Display>
-  <Edit>DocumentLibraryForm</Edit>
-  <New>DocumentLibraryForm</New>
-</FormTemplates>
-</file>
-
-<file path=customXml/item3.xml><?xml version="1.0" encoding="utf-8"?>
-<b:Sources xmlns:b="http://schemas.openxmlformats.org/officeDocument/2006/bibliography" xmlns="http://schemas.openxmlformats.org/officeDocument/2006/bibliography" SelectedStyle="\MLA.XSL" StyleName="MLA"/>
-</file>
-
-<file path=customXml/item4.xml><?xml version="1.0" encoding="utf-8"?>
 <ct:contentTypeSchema xmlns:ct="http://schemas.microsoft.com/office/2006/metadata/contentType" xmlns:ma="http://schemas.microsoft.com/office/2006/metadata/properties/metaAttributes" ct:_="" ma:_="" ma:contentTypeName="Document" ma:contentTypeID="0x01010088CE47F754C76E4E816A66E05339225A" ma:contentTypeVersion="13" ma:contentTypeDescription="Create a new document." ma:contentTypeScope="" ma:versionID="076a7d54fdb0b635cd2e2f75f54c1b16">
   <xsd:schema xmlns:xsd="http://www.w3.org/2001/XMLSchema" xmlns:xs="http://www.w3.org/2001/XMLSchema" xmlns:p="http://schemas.microsoft.com/office/2006/metadata/properties" xmlns:ns1="http://schemas.microsoft.com/sharepoint/v3" xmlns:ns2="72f5c66d-4f9b-4523-9c59-0147434cba56" xmlns:ns3="d5671106-6e7e-4942-8aee-9bcd5dd7e66b" targetNamespace="http://schemas.microsoft.com/office/2006/metadata/properties" ma:root="true" ma:fieldsID="733d59cbe7e7cf634dfb746df9f4de01" ns1:_="" ns2:_="" ns3:_="">
     <xsd:import namespace="http://schemas.microsoft.com/sharepoint/v3"/>
@@ -16724,27 +14055,29 @@
 </ct:contentTypeSchema>
 </file>
 
-<file path=customXml/itemProps1.xml><?xml version="1.0" encoding="utf-8"?>
-<ds:datastoreItem xmlns:ds="http://schemas.openxmlformats.org/officeDocument/2006/customXml" ds:itemID="{2FE68222-D1D7-4405-9D8B-445901EEA94E}">
-  <ds:schemaRefs>
-    <ds:schemaRef ds:uri="http://schemas.microsoft.com/office/2006/metadata/properties"/>
-    <ds:schemaRef ds:uri="http://schemas.microsoft.com/office/infopath/2007/PartnerControls"/>
-    <ds:schemaRef ds:uri="http://schemas.microsoft.com/sharepoint/v3"/>
-    <ds:schemaRef ds:uri="72f5c66d-4f9b-4523-9c59-0147434cba56"/>
-    <ds:schemaRef ds:uri="d5671106-6e7e-4942-8aee-9bcd5dd7e66b"/>
-  </ds:schemaRefs>
-</ds:datastoreItem>
+<file path=customXml/item3.xml><?xml version="1.0" encoding="utf-8"?>
+<p:properties xmlns:p="http://schemas.microsoft.com/office/2006/metadata/properties" xmlns:xsi="http://www.w3.org/2001/XMLSchema-instance" xmlns:pc="http://schemas.microsoft.com/office/infopath/2007/PartnerControls">
+  <documentManagement>
+    <_ip_UnifiedCompliancePolicyUIAction xmlns="http://schemas.microsoft.com/sharepoint/v3" xsi:nil="true"/>
+    <lcf76f155ced4ddcb4097134ff3c332f xmlns="72f5c66d-4f9b-4523-9c59-0147434cba56">
+      <Terms xmlns="http://schemas.microsoft.com/office/infopath/2007/PartnerControls"/>
+    </lcf76f155ced4ddcb4097134ff3c332f>
+    <TaxCatchAll xmlns="d5671106-6e7e-4942-8aee-9bcd5dd7e66b" xsi:nil="true"/>
+    <_ip_UnifiedCompliancePolicyProperties xmlns="http://schemas.microsoft.com/sharepoint/v3" xsi:nil="true"/>
+  </documentManagement>
+</p:properties>
 </file>
 
-<file path=customXml/itemProps2.xml><?xml version="1.0" encoding="utf-8"?>
-<ds:datastoreItem xmlns:ds="http://schemas.openxmlformats.org/officeDocument/2006/customXml" ds:itemID="{C793F174-B33D-4AAE-9E3B-9A362A6F4892}">
-  <ds:schemaRefs>
-    <ds:schemaRef ds:uri="http://schemas.microsoft.com/sharepoint/v3/contenttype/forms"/>
-  </ds:schemaRefs>
-</ds:datastoreItem>
+<file path=customXml/item4.xml><?xml version="1.0" encoding="utf-8"?>
+<?mso-contentType ?>
+<FormTemplates xmlns="http://schemas.microsoft.com/sharepoint/v3/contenttype/forms">
+  <Display>DocumentLibraryForm</Display>
+  <Edit>DocumentLibraryForm</Edit>
+  <New>DocumentLibraryForm</New>
+</FormTemplates>
 </file>
 
-<file path=customXml/itemProps3.xml><?xml version="1.0" encoding="utf-8"?>
+<file path=customXml/itemProps1.xml><?xml version="1.0" encoding="utf-8"?>
 <ds:datastoreItem xmlns:ds="http://schemas.openxmlformats.org/officeDocument/2006/customXml" ds:itemID="{6A404842-743E-4BBC-99A7-70A911F17733}">
   <ds:schemaRefs>
     <ds:schemaRef ds:uri="http://schemas.openxmlformats.org/officeDocument/2006/bibliography"/>
@@ -16752,7 +14085,7 @@
 </ds:datastoreItem>
 </file>
 
-<file path=customXml/itemProps4.xml><?xml version="1.0" encoding="utf-8"?>
+<file path=customXml/itemProps2.xml><?xml version="1.0" encoding="utf-8"?>
 <ds:datastoreItem xmlns:ds="http://schemas.openxmlformats.org/officeDocument/2006/customXml" ds:itemID="{77819383-3D86-46CF-A5E7-D6F9C756A7E0}">
   <ds:schemaRefs>
     <ds:schemaRef ds:uri="http://schemas.microsoft.com/office/2006/metadata/contentType"/>
@@ -16770,4 +14103,24 @@
     <ds:schemaRef ds:uri="http://schemas.microsoft.com/internal/obd"/>
   </ds:schemaRefs>
 </ds:datastoreItem>
+</file>
+
+<file path=customXml/itemProps3.xml><?xml version="1.0" encoding="utf-8"?>
+<ds:datastoreItem xmlns:ds="http://schemas.openxmlformats.org/officeDocument/2006/customXml" ds:itemID="{2FE68222-D1D7-4405-9D8B-445901EEA94E}">
+  <ds:schemaRefs>
+    <ds:schemaRef ds:uri="http://schemas.microsoft.com/office/2006/metadata/properties"/>
+    <ds:schemaRef ds:uri="http://schemas.microsoft.com/office/infopath/2007/PartnerControls"/>
+    <ds:schemaRef ds:uri="http://schemas.microsoft.com/sharepoint/v3"/>
+    <ds:schemaRef ds:uri="72f5c66d-4f9b-4523-9c59-0147434cba56"/>
+    <ds:schemaRef ds:uri="d5671106-6e7e-4942-8aee-9bcd5dd7e66b"/>
+  </ds:schemaRefs>
+</ds:datastoreItem>
+</file>
+
+<file path=customXml/itemProps4.xml><?xml version="1.0" encoding="utf-8"?>
+<ds:datastoreItem xmlns:ds="http://schemas.openxmlformats.org/officeDocument/2006/customXml" ds:itemID="{C793F174-B33D-4AAE-9E3B-9A362A6F4892}">
+  <ds:schemaRefs>
+    <ds:schemaRef ds:uri="http://schemas.microsoft.com/sharepoint/v3/contenttype/forms"/>
+  </ds:schemaRefs>
+</ds:datastoreItem>
 </file>
</xml_diff>